<commit_message>
Updated guide word document
</commit_message>
<xml_diff>
--- a/guide_to_docker_images.docx
+++ b/guide_to_docker_images.docx
@@ -2,6 +2,1168 @@
 <file path=word/document.xml><?xml version="1.0" encoding="utf-8"?>
 <w:document xmlns:wpc="http://schemas.microsoft.com/office/word/2010/wordprocessingCanvas" xmlns:cx="http://schemas.microsoft.com/office/drawing/2014/chartex" xmlns:cx1="http://schemas.microsoft.com/office/drawing/2015/9/8/chartex" xmlns:cx2="http://schemas.microsoft.com/office/drawing/2015/10/21/chartex" xmlns:cx3="http://schemas.microsoft.com/office/drawing/2016/5/9/chartex" xmlns:cx4="http://schemas.microsoft.com/office/drawing/2016/5/10/chartex" xmlns:cx5="http://schemas.microsoft.com/office/drawing/2016/5/11/chartex" xmlns:cx6="http://schemas.microsoft.com/office/drawing/2016/5/12/chartex" xmlns:cx7="http://schemas.microsoft.com/office/drawing/2016/5/13/chartex" xmlns:cx8="http://schemas.microsoft.com/office/drawing/2016/5/14/chartex" xmlns:mc="http://schemas.openxmlformats.org/markup-compatibility/2006" xmlns:m="http://schemas.openxmlformats.org/officeDocument/2006/math" xmlns:aink="http://schemas.microsoft.com/office/drawing/2016/ink" xmlns:am3d="http://schemas.microsoft.com/office/drawing/2017/model3d" xmlns:oel="http://schemas.microsoft.com/office/2019/extlst" xmlns:r="http://schemas.openxmlformats.org/officeDocument/2006/relationships" xmlns:wp14="http://schemas.microsoft.com/office/word/2010/wordprocessingDrawing" xmlns:wp="http://schemas.openxmlformats.org/drawingml/2006/wordprocessingDrawing" xmlns:wpg="http://schemas.microsoft.com/office/word/2010/wordprocessingGroup" xmlns:wpi="http://schemas.microsoft.com/office/word/2010/wordprocessingInk" xmlns:wps="http://schemas.microsoft.com/office/word/2010/wordprocessingShape" xmlns:o="urn:schemas-microsoft-com:office:office" xmlns:v="urn:schemas-microsoft-com:vml" xmlns:w10="urn:schemas-microsoft-com:office:word" xmlns:w="http://schemas.openxmlformats.org/wordprocessingml/2006/main" xmlns:w14="http://schemas.microsoft.com/office/word/2010/wordml" xmlns:w15="http://schemas.microsoft.com/office/word/2012/wordml" xmlns:w16cex="http://schemas.microsoft.com/office/word/2018/wordml/cex" xmlns:w16cid="http://schemas.microsoft.com/office/word/2016/wordml/cid" xmlns:w16="http://schemas.microsoft.com/office/word/2018/wordml" xmlns:w16sdtdh="http://schemas.microsoft.com/office/word/2020/wordml/sdtdatahash" xmlns:w16sdtfl="http://schemas.microsoft.com/office/word/2024/wordml/sdtformatlock" xmlns:w16se="http://schemas.microsoft.com/office/word/2015/wordml/symex" xmlns:w16du="http://schemas.microsoft.com/office/word/2023/wordml/word16du" xmlns:wne="http://schemas.microsoft.com/office/word/2006/wordml" mc:Ignorable="w14 w15 w16se w16cid w16 w16cex w16sdtdh w16sdtfl w16du wp14">
   <w:body>
+    <w:p>
+      <w:pPr>
+        <w:jc w:val="center"/>
+        <w:rPr>
+          <w:b/>
+          <w:bCs/>
+          <w:sz w:val="32"/>
+          <w:szCs w:val="32"/>
+          <w:lang w:val="en-US"/>
+        </w:rPr>
+      </w:pPr>
+      <w:r>
+        <w:rPr>
+          <w:b/>
+          <w:bCs/>
+          <w:sz w:val="32"/>
+          <w:szCs w:val="32"/>
+          <w:lang w:val="en-US"/>
+        </w:rPr>
+        <w:t>A Guide to Building Docker Images</w:t>
+      </w:r>
+    </w:p>
+    <w:p>
+      <w:pPr>
+        <w:rPr>
+          <w:lang w:val="en-US"/>
+        </w:rPr>
+      </w:pPr>
+      <w:r>
+        <w:rPr>
+          <w:lang w:val="en-US"/>
+        </w:rPr>
+        <w:t>Sources:</w:t>
+      </w:r>
+    </w:p>
+    <w:p>
+      <w:pPr>
+        <w:rPr>
+          <w:lang w:val="en-US"/>
+        </w:rPr>
+      </w:pPr>
+      <w:hyperlink r:id="rId5" w:history="1">
+        <w:r>
+          <w:rPr>
+            <w:rStyle w:val="Hyperlink"/>
+            <w:lang w:val="en-US"/>
+          </w:rPr>
+          <w:t>https://seqera.io/blog/building-containers-for-scientific-workflows/</w:t>
+        </w:r>
+      </w:hyperlink>
+    </w:p>
+    <w:p>
+      <w:pPr>
+        <w:rPr>
+          <w:lang w:val="en-US"/>
+        </w:rPr>
+      </w:pPr>
+      <w:hyperlink r:id="rId6" w:history="1">
+        <w:r>
+          <w:rPr>
+            <w:rStyle w:val="Hyperlink"/>
+            <w:lang w:val="en-US"/>
+          </w:rPr>
+          <w:t>https://pythonspeed.com/articles/base-image-python-docker-images/</w:t>
+        </w:r>
+      </w:hyperlink>
+    </w:p>
+    <w:p>
+      <w:pPr>
+        <w:rPr>
+          <w:lang w:val="en-US"/>
+        </w:rPr>
+      </w:pPr>
+      <w:hyperlink r:id="rId7" w:anchor="maintainer-deprecated" w:history="1">
+        <w:r>
+          <w:rPr>
+            <w:rStyle w:val="Hyperlink"/>
+            <w:lang w:val="en-US"/>
+          </w:rPr>
+          <w:t>https://docs.docker.com/reference/dockerfile#maintainer-deprecated</w:t>
+        </w:r>
+      </w:hyperlink>
+    </w:p>
+    <w:p>
+      <w:pPr>
+        <w:rPr>
+          <w:lang w:val="en-US"/>
+        </w:rPr>
+      </w:pPr>
+      <w:hyperlink r:id="rId8" w:history="1">
+        <w:r>
+          <w:rPr>
+            <w:rStyle w:val="Hyperlink"/>
+            <w:lang w:val="en-US"/>
+          </w:rPr>
+          <w:t>https://seqera.io/containers/</w:t>
+        </w:r>
+      </w:hyperlink>
+    </w:p>
+    <w:p>
+      <w:pPr>
+        <w:pStyle w:val="Heading1"/>
+        <w:rPr>
+          <w:lang w:val="en-US"/>
+        </w:rPr>
+      </w:pPr>
+      <w:r>
+        <w:rPr>
+          <w:lang w:val="en-US"/>
+        </w:rPr>
+        <w:t>What is Docker?</w:t>
+      </w:r>
+    </w:p>
+    <w:p>
+      <w:pPr>
+        <w:rPr>
+          <w:lang w:val="en-US"/>
+        </w:rPr>
+      </w:pPr>
+      <w:r>
+        <w:rPr>
+          <w:lang w:val="en-US"/>
+        </w:rPr>
+        <w:t xml:space="preserve">Docker is a software platform that packages </w:t>
+      </w:r>
+      <w:r>
+        <w:rPr>
+          <w:lang w:val="en-US"/>
+        </w:rPr>
+        <w:t xml:space="preserve">your </w:t>
+      </w:r>
+      <w:r>
+        <w:rPr>
+          <w:lang w:val="en-US"/>
+        </w:rPr>
+        <w:t xml:space="preserve">software into </w:t>
+      </w:r>
+      <w:r>
+        <w:rPr>
+          <w:lang w:val="en-US"/>
+        </w:rPr>
+        <w:t xml:space="preserve">isolated </w:t>
+      </w:r>
+      <w:r>
+        <w:rPr>
+          <w:lang w:val="en-US"/>
+        </w:rPr>
+        <w:t>units called containers, which include</w:t>
+      </w:r>
+      <w:r>
+        <w:rPr>
+          <w:lang w:val="en-US"/>
+        </w:rPr>
+        <w:t>s</w:t>
+      </w:r>
+      <w:r>
+        <w:rPr>
+          <w:lang w:val="en-US"/>
+        </w:rPr>
+        <w:t xml:space="preserve"> everything </w:t>
+      </w:r>
+      <w:r>
+        <w:rPr>
+          <w:lang w:val="en-US"/>
+        </w:rPr>
+        <w:t>your</w:t>
+      </w:r>
+      <w:r>
+        <w:rPr>
+          <w:lang w:val="en-US"/>
+        </w:rPr>
+        <w:t xml:space="preserve"> software needs to run — libraries, system tools, code, and runtime (OS, </w:t>
+      </w:r>
+      <w:r>
+        <w:rPr>
+          <w:lang w:val="en-US"/>
+        </w:rPr>
+        <w:t>and</w:t>
+      </w:r>
+      <w:r>
+        <w:rPr>
+          <w:lang w:val="en-US"/>
+        </w:rPr>
+        <w:t xml:space="preserve"> binaries).</w:t>
+      </w:r>
+    </w:p>
+    <w:p>
+      <w:pPr>
+        <w:rPr>
+          <w:b/>
+          <w:bCs/>
+          <w:lang w:val="en-US"/>
+        </w:rPr>
+      </w:pPr>
+      <w:r>
+        <w:rPr>
+          <w:b/>
+          <w:bCs/>
+          <w:lang w:val="en-US"/>
+        </w:rPr>
+        <w:t>Advantages of using Docker:</w:t>
+      </w:r>
+    </w:p>
+    <w:p>
+      <w:pPr>
+        <w:pStyle w:val="ListParagraph"/>
+        <w:numPr>
+          <w:ilvl w:val="0"/>
+          <w:numId w:val="5"/>
+        </w:numPr>
+        <w:rPr>
+          <w:lang w:val="en-US"/>
+        </w:rPr>
+      </w:pPr>
+      <w:r>
+        <w:rPr>
+          <w:lang w:val="en-US"/>
+        </w:rPr>
+        <w:t xml:space="preserve">Offers </w:t>
+      </w:r>
+      <w:r>
+        <w:rPr>
+          <w:lang w:val="en-US"/>
+        </w:rPr>
+        <w:t xml:space="preserve">a </w:t>
+      </w:r>
+      <w:r>
+        <w:rPr>
+          <w:lang w:val="en-US"/>
+        </w:rPr>
+        <w:t>highly portable, OS-level process isolation, allowing programs to run in lightweight packages across different operating environments.</w:t>
+      </w:r>
+    </w:p>
+    <w:p>
+      <w:pPr>
+        <w:pStyle w:val="ListParagraph"/>
+        <w:numPr>
+          <w:ilvl w:val="0"/>
+          <w:numId w:val="5"/>
+        </w:numPr>
+        <w:rPr>
+          <w:lang w:val="en-US"/>
+        </w:rPr>
+      </w:pPr>
+      <w:r>
+        <w:rPr>
+          <w:lang w:val="en-US"/>
+        </w:rPr>
+        <w:t>Once built, a container runs identically anywhere — laptop, workstation, HPC, cloud platforms.</w:t>
+      </w:r>
+    </w:p>
+    <w:p>
+      <w:pPr>
+        <w:pStyle w:val="ListParagraph"/>
+        <w:numPr>
+          <w:ilvl w:val="0"/>
+          <w:numId w:val="5"/>
+        </w:numPr>
+        <w:rPr>
+          <w:lang w:val="en-US"/>
+        </w:rPr>
+      </w:pPr>
+      <w:r>
+        <w:rPr>
+          <w:lang w:val="en-US"/>
+        </w:rPr>
+        <w:t xml:space="preserve">No dependency management required — everything is already </w:t>
+      </w:r>
+      <w:r>
+        <w:rPr>
+          <w:lang w:val="en-US"/>
+        </w:rPr>
+        <w:t>encapsulat</w:t>
+      </w:r>
+      <w:r>
+        <w:rPr>
+          <w:lang w:val="en-US"/>
+        </w:rPr>
+        <w:t>ed</w:t>
+      </w:r>
+      <w:r>
+        <w:rPr>
+          <w:lang w:val="en-US"/>
+        </w:rPr>
+        <w:t xml:space="preserve"> </w:t>
+      </w:r>
+      <w:r>
+        <w:rPr>
+          <w:lang w:val="en-US"/>
+        </w:rPr>
+        <w:t>in the image.</w:t>
+      </w:r>
+    </w:p>
+    <w:p>
+      <w:pPr>
+        <w:pStyle w:val="ListParagraph"/>
+        <w:numPr>
+          <w:ilvl w:val="0"/>
+          <w:numId w:val="5"/>
+        </w:numPr>
+        <w:rPr>
+          <w:lang w:val="en-US"/>
+        </w:rPr>
+      </w:pPr>
+      <w:r>
+        <w:rPr>
+          <w:lang w:val="en-US"/>
+        </w:rPr>
+        <w:t>Docker images are construct</w:t>
+      </w:r>
+      <w:r>
+        <w:rPr>
+          <w:lang w:val="en-US"/>
+        </w:rPr>
+        <w:t>ed</w:t>
+      </w:r>
+      <w:r>
+        <w:rPr>
+          <w:lang w:val="en-US"/>
+        </w:rPr>
+        <w:t xml:space="preserve"> </w:t>
+      </w:r>
+      <w:r>
+        <w:rPr>
+          <w:lang w:val="en-US"/>
+        </w:rPr>
+        <w:t>in</w:t>
+      </w:r>
+      <w:r>
+        <w:rPr>
+          <w:lang w:val="en-US"/>
+        </w:rPr>
+        <w:t xml:space="preserve"> multiple layers</w:t>
+      </w:r>
+      <w:r>
+        <w:rPr>
+          <w:lang w:val="en-US"/>
+        </w:rPr>
+        <w:t xml:space="preserve"> where e</w:t>
+      </w:r>
+      <w:r>
+        <w:rPr>
+          <w:lang w:val="en-US"/>
+        </w:rPr>
+        <w:t xml:space="preserve">ach layer corresponds to an instruction in the </w:t>
+      </w:r>
+      <w:proofErr w:type="spellStart"/>
+      <w:r>
+        <w:rPr>
+          <w:lang w:val="en-US"/>
+        </w:rPr>
+        <w:t>Dockerfile</w:t>
+      </w:r>
+      <w:proofErr w:type="spellEnd"/>
+      <w:r>
+        <w:rPr>
+          <w:lang w:val="en-US"/>
+        </w:rPr>
+        <w:t xml:space="preserve"> </w:t>
+      </w:r>
+      <w:r>
+        <w:rPr>
+          <w:lang w:val="en-US"/>
+        </w:rPr>
+        <w:t xml:space="preserve">that was </w:t>
+      </w:r>
+      <w:r>
+        <w:rPr>
+          <w:lang w:val="en-US"/>
+        </w:rPr>
+        <w:t>used to build the image</w:t>
+      </w:r>
+      <w:r>
+        <w:rPr>
+          <w:lang w:val="en-US"/>
+        </w:rPr>
+        <w:t>.</w:t>
+      </w:r>
+    </w:p>
+    <w:p>
+      <w:pPr>
+        <w:pStyle w:val="ListParagraph"/>
+        <w:numPr>
+          <w:ilvl w:val="0"/>
+          <w:numId w:val="5"/>
+        </w:numPr>
+        <w:rPr>
+          <w:lang w:val="en-US"/>
+        </w:rPr>
+      </w:pPr>
+      <w:r>
+        <w:rPr>
+          <w:lang w:val="en-US"/>
+        </w:rPr>
+        <w:t>W</w:t>
+      </w:r>
+      <w:r>
+        <w:rPr>
+          <w:lang w:val="en-US"/>
+        </w:rPr>
+        <w:t>hen a new image version is built, only the changed layers need to be downloaded rather than the entire image</w:t>
+      </w:r>
+      <w:r>
+        <w:rPr>
+          <w:lang w:val="en-US"/>
+        </w:rPr>
+        <w:t>, saving space</w:t>
+      </w:r>
+      <w:r>
+        <w:rPr>
+          <w:lang w:val="en-US"/>
+        </w:rPr>
+        <w:t>.</w:t>
+      </w:r>
+    </w:p>
+    <w:p>
+      <w:pPr>
+        <w:pStyle w:val="ListParagraph"/>
+        <w:numPr>
+          <w:ilvl w:val="0"/>
+          <w:numId w:val="5"/>
+        </w:numPr>
+        <w:rPr>
+          <w:lang w:val="en-US"/>
+        </w:rPr>
+      </w:pPr>
+      <w:r>
+        <w:rPr>
+          <w:lang w:val="en-US"/>
+        </w:rPr>
+        <w:t>Common layers shared across images derived from the same base are stored only once on the host OS, avoiding redundant duplication.</w:t>
+      </w:r>
+    </w:p>
+    <w:p>
+      <w:pPr>
+        <w:pStyle w:val="ListParagraph"/>
+        <w:numPr>
+          <w:ilvl w:val="0"/>
+          <w:numId w:val="5"/>
+        </w:numPr>
+        <w:rPr>
+          <w:lang w:val="en-US"/>
+        </w:rPr>
+      </w:pPr>
+      <w:proofErr w:type="spellStart"/>
+      <w:r>
+        <w:rPr>
+          <w:lang w:val="en-US"/>
+        </w:rPr>
+        <w:t>C</w:t>
+      </w:r>
+      <w:r>
+        <w:rPr>
+          <w:lang w:val="en-US"/>
+        </w:rPr>
+        <w:t>pu</w:t>
+      </w:r>
+      <w:proofErr w:type="spellEnd"/>
+      <w:r>
+        <w:rPr>
+          <w:lang w:val="en-US"/>
+        </w:rPr>
+        <w:t xml:space="preserve"> and </w:t>
+      </w:r>
+      <w:r>
+        <w:rPr>
+          <w:lang w:val="en-US"/>
+        </w:rPr>
+        <w:t>memory usage of a container</w:t>
+      </w:r>
+      <w:r>
+        <w:rPr>
+          <w:lang w:val="en-US"/>
+        </w:rPr>
+        <w:t xml:space="preserve"> can be capped</w:t>
+      </w:r>
+      <w:r>
+        <w:rPr>
+          <w:lang w:val="en-US"/>
+        </w:rPr>
+        <w:t>.</w:t>
+      </w:r>
+    </w:p>
+    <w:p>
+      <w:pPr>
+        <w:rPr>
+          <w:lang w:val="en-US"/>
+        </w:rPr>
+      </w:pPr>
+      <w:r>
+        <w:rPr>
+          <w:b/>
+          <w:bCs/>
+          <w:lang w:val="en-US"/>
+        </w:rPr>
+        <w:t>Disadvantages of Docker:</w:t>
+      </w:r>
+    </w:p>
+    <w:p>
+      <w:pPr>
+        <w:rPr>
+          <w:lang w:val="en-US"/>
+        </w:rPr>
+      </w:pPr>
+      <w:r>
+        <w:rPr>
+          <w:lang w:val="en-US"/>
+        </w:rPr>
+        <w:t>Docker requires root privileges and therefore cannot run on HPC/cluster environments. However, Docker images can be pulled directly into Singularity, which runs containers without root.</w:t>
+      </w:r>
+    </w:p>
+    <w:p>
+      <w:pPr>
+        <w:rPr>
+          <w:b/>
+          <w:bCs/>
+          <w:lang w:val="en-US"/>
+        </w:rPr>
+      </w:pPr>
+      <w:r>
+        <w:rPr>
+          <w:b/>
+          <w:bCs/>
+          <w:lang w:val="en-US"/>
+        </w:rPr>
+        <w:t>Alternatives to Docker</w:t>
+      </w:r>
+      <w:r>
+        <w:rPr>
+          <w:b/>
+          <w:bCs/>
+          <w:lang w:val="en-US"/>
+        </w:rPr>
+        <w:t>:</w:t>
+      </w:r>
+      <w:r>
+        <w:rPr>
+          <w:b/>
+          <w:bCs/>
+          <w:lang w:val="en-US"/>
+        </w:rPr>
+        <w:t xml:space="preserve"> </w:t>
+      </w:r>
+      <w:r>
+        <w:rPr>
+          <w:lang w:val="en-US"/>
+        </w:rPr>
+        <w:t xml:space="preserve">Singularity, Shifter, and </w:t>
+      </w:r>
+      <w:proofErr w:type="spellStart"/>
+      <w:r>
+        <w:rPr>
+          <w:lang w:val="en-US"/>
+        </w:rPr>
+        <w:t>Podman</w:t>
+      </w:r>
+      <w:proofErr w:type="spellEnd"/>
+      <w:r>
+        <w:rPr>
+          <w:lang w:val="en-US"/>
+        </w:rPr>
+        <w:t>.</w:t>
+      </w:r>
+    </w:p>
+    <w:p>
+      <w:pPr>
+        <w:rPr>
+          <w:b/>
+          <w:bCs/>
+          <w:lang w:val="en-US"/>
+        </w:rPr>
+      </w:pPr>
+    </w:p>
+    <w:p>
+      <w:pPr>
+        <w:pStyle w:val="Heading1"/>
+        <w:rPr>
+          <w:lang w:val="en-US"/>
+        </w:rPr>
+      </w:pPr>
+      <w:r>
+        <w:rPr>
+          <w:lang w:val="en-US"/>
+        </w:rPr>
+        <w:lastRenderedPageBreak/>
+        <w:t xml:space="preserve">How to build a </w:t>
+      </w:r>
+      <w:r>
+        <w:rPr>
+          <w:lang w:val="en-US"/>
+        </w:rPr>
+        <w:t>Docker image</w:t>
+      </w:r>
+      <w:r>
+        <w:rPr>
+          <w:lang w:val="en-US"/>
+        </w:rPr>
+        <w:t>?</w:t>
+      </w:r>
+    </w:p>
+    <w:p>
+      <w:pPr>
+        <w:rPr>
+          <w:lang w:val="en-US"/>
+        </w:rPr>
+      </w:pPr>
+      <w:r>
+        <w:rPr>
+          <w:lang w:val="en-US"/>
+        </w:rPr>
+        <w:t>Building a</w:t>
+      </w:r>
+      <w:r>
+        <w:rPr>
+          <w:lang w:val="en-US"/>
+        </w:rPr>
+        <w:t xml:space="preserve"> Docker</w:t>
+      </w:r>
+      <w:r>
+        <w:rPr>
+          <w:lang w:val="en-US"/>
+        </w:rPr>
+        <w:t xml:space="preserve"> </w:t>
+      </w:r>
+      <w:r>
+        <w:rPr>
+          <w:lang w:val="en-US"/>
+        </w:rPr>
+        <w:t>image</w:t>
+      </w:r>
+      <w:r>
+        <w:rPr>
+          <w:lang w:val="en-US"/>
+        </w:rPr>
+        <w:t xml:space="preserve"> requires</w:t>
+      </w:r>
+      <w:r>
+        <w:rPr>
+          <w:lang w:val="en-US"/>
+        </w:rPr>
+        <w:t>:</w:t>
+      </w:r>
+    </w:p>
+    <w:p>
+      <w:pPr>
+        <w:pStyle w:val="ListParagraph"/>
+        <w:numPr>
+          <w:ilvl w:val="0"/>
+          <w:numId w:val="6"/>
+        </w:numPr>
+        <w:rPr>
+          <w:lang w:val="en-US"/>
+        </w:rPr>
+      </w:pPr>
+      <w:proofErr w:type="spellStart"/>
+      <w:r>
+        <w:rPr>
+          <w:lang w:val="en-US"/>
+        </w:rPr>
+        <w:t>Dockerfile</w:t>
+      </w:r>
+      <w:proofErr w:type="spellEnd"/>
+      <w:r>
+        <w:rPr>
+          <w:lang w:val="en-US"/>
+        </w:rPr>
+        <w:t xml:space="preserve"> –</w:t>
+      </w:r>
+      <w:r>
+        <w:rPr>
+          <w:lang w:val="en-US"/>
+        </w:rPr>
+        <w:t xml:space="preserve"> </w:t>
+      </w:r>
+      <w:r>
+        <w:rPr>
+          <w:lang w:val="en-US"/>
+        </w:rPr>
+        <w:t xml:space="preserve">a </w:t>
+      </w:r>
+      <w:r>
+        <w:rPr>
+          <w:lang w:val="en-US"/>
+        </w:rPr>
+        <w:t xml:space="preserve">text document </w:t>
+      </w:r>
+      <w:r>
+        <w:rPr>
+          <w:lang w:val="en-US"/>
+        </w:rPr>
+        <w:t xml:space="preserve">that </w:t>
+      </w:r>
+      <w:r>
+        <w:rPr>
+          <w:lang w:val="en-US"/>
+        </w:rPr>
+        <w:t>contain</w:t>
+      </w:r>
+      <w:r>
+        <w:rPr>
+          <w:lang w:val="en-US"/>
+        </w:rPr>
+        <w:t>s</w:t>
+      </w:r>
+      <w:r>
+        <w:rPr>
+          <w:lang w:val="en-US"/>
+        </w:rPr>
+        <w:t xml:space="preserve"> the </w:t>
+      </w:r>
+      <w:r>
+        <w:rPr>
+          <w:lang w:val="en-US"/>
+        </w:rPr>
+        <w:t>set of commands</w:t>
+      </w:r>
+      <w:r>
+        <w:rPr>
+          <w:lang w:val="en-US"/>
+        </w:rPr>
+        <w:t xml:space="preserve"> </w:t>
+      </w:r>
+      <w:r>
+        <w:rPr>
+          <w:lang w:val="en-US"/>
+        </w:rPr>
+        <w:t xml:space="preserve">used </w:t>
+      </w:r>
+      <w:r>
+        <w:rPr>
+          <w:lang w:val="en-US"/>
+        </w:rPr>
+        <w:t>to build a Docker image</w:t>
+      </w:r>
+      <w:r>
+        <w:rPr>
+          <w:lang w:val="en-US"/>
+        </w:rPr>
+        <w:t>.</w:t>
+      </w:r>
+      <w:r>
+        <w:rPr>
+          <w:lang w:val="en-US"/>
+        </w:rPr>
+        <w:t xml:space="preserve"> </w:t>
+      </w:r>
+      <w:r>
+        <w:rPr>
+          <w:lang w:val="en-US"/>
+        </w:rPr>
+        <w:t>It h</w:t>
+      </w:r>
+      <w:r>
+        <w:rPr>
+          <w:lang w:val="en-US"/>
+        </w:rPr>
+        <w:t xml:space="preserve">as </w:t>
+      </w:r>
+      <w:r>
+        <w:rPr>
+          <w:lang w:val="en-US"/>
+        </w:rPr>
+        <w:t xml:space="preserve">a </w:t>
+      </w:r>
+      <w:r>
+        <w:rPr>
+          <w:lang w:val="en-US"/>
+        </w:rPr>
+        <w:t xml:space="preserve">reference to </w:t>
+      </w:r>
+      <w:r>
+        <w:rPr>
+          <w:lang w:val="en-US"/>
+        </w:rPr>
+        <w:t xml:space="preserve">base image and </w:t>
+      </w:r>
+      <w:r>
+        <w:rPr>
+          <w:lang w:val="en-US"/>
+        </w:rPr>
+        <w:t xml:space="preserve">the </w:t>
+      </w:r>
+      <w:r>
+        <w:rPr>
+          <w:lang w:val="en-US"/>
+        </w:rPr>
+        <w:t xml:space="preserve">commands to construct </w:t>
+      </w:r>
+      <w:r>
+        <w:rPr>
+          <w:lang w:val="en-US"/>
+        </w:rPr>
+        <w:t>upon it</w:t>
+      </w:r>
+      <w:r>
+        <w:rPr>
+          <w:lang w:val="en-US"/>
+        </w:rPr>
+        <w:t>.</w:t>
+      </w:r>
+    </w:p>
+    <w:p>
+      <w:pPr>
+        <w:pStyle w:val="ListParagraph"/>
+        <w:numPr>
+          <w:ilvl w:val="0"/>
+          <w:numId w:val="6"/>
+        </w:numPr>
+        <w:rPr>
+          <w:lang w:val="en-US"/>
+        </w:rPr>
+      </w:pPr>
+      <w:r>
+        <w:rPr>
+          <w:lang w:val="en-US"/>
+        </w:rPr>
+        <w:t xml:space="preserve">Environment specifications in </w:t>
+      </w:r>
+      <w:proofErr w:type="gramStart"/>
+      <w:r>
+        <w:rPr>
+          <w:lang w:val="en-US"/>
+        </w:rPr>
+        <w:t>a .</w:t>
+      </w:r>
+      <w:proofErr w:type="spellStart"/>
+      <w:r>
+        <w:rPr>
+          <w:lang w:val="en-US"/>
+        </w:rPr>
+        <w:t>yaml</w:t>
+      </w:r>
+      <w:proofErr w:type="spellEnd"/>
+      <w:proofErr w:type="gramEnd"/>
+      <w:r>
+        <w:rPr>
+          <w:lang w:val="en-US"/>
+        </w:rPr>
+        <w:t xml:space="preserve"> or </w:t>
+      </w:r>
+      <w:r>
+        <w:rPr>
+          <w:lang w:val="en-US"/>
+        </w:rPr>
+        <w:t>.</w:t>
+      </w:r>
+      <w:proofErr w:type="spellStart"/>
+      <w:r>
+        <w:rPr>
+          <w:lang w:val="en-US"/>
+        </w:rPr>
+        <w:t>yml</w:t>
+      </w:r>
+      <w:proofErr w:type="spellEnd"/>
+      <w:r>
+        <w:rPr>
+          <w:lang w:val="en-US"/>
+        </w:rPr>
+        <w:t xml:space="preserve"> file</w:t>
+      </w:r>
+      <w:r>
+        <w:rPr>
+          <w:lang w:val="en-US"/>
+        </w:rPr>
+        <w:t xml:space="preserve"> (special files </w:t>
+      </w:r>
+      <w:r>
+        <w:rPr>
+          <w:lang w:val="en-US"/>
+        </w:rPr>
+        <w:t>used to specify and share configurations</w:t>
+      </w:r>
+      <w:r>
+        <w:rPr>
+          <w:lang w:val="en-US"/>
+        </w:rPr>
+        <w:t>/application settings</w:t>
+      </w:r>
+      <w:r>
+        <w:rPr>
+          <w:lang w:val="en-US"/>
+        </w:rPr>
+        <w:t>)</w:t>
+      </w:r>
+    </w:p>
+    <w:p>
+      <w:pPr>
+        <w:rPr>
+          <w:lang w:val="en-US"/>
+        </w:rPr>
+      </w:pPr>
+      <w:r>
+        <w:rPr>
+          <w:lang w:val="en-US"/>
+        </w:rPr>
+        <w:t xml:space="preserve">Users can either build their own image </w:t>
+      </w:r>
+      <w:r>
+        <w:rPr>
+          <w:lang w:val="en-US"/>
+        </w:rPr>
+        <w:t xml:space="preserve">in their system </w:t>
+      </w:r>
+      <w:r>
+        <w:rPr>
+          <w:lang w:val="en-US"/>
+        </w:rPr>
+        <w:t xml:space="preserve">using these </w:t>
+      </w:r>
+      <w:r>
+        <w:rPr>
+          <w:lang w:val="en-US"/>
+        </w:rPr>
+        <w:t xml:space="preserve">files </w:t>
+      </w:r>
+      <w:r>
+        <w:rPr>
+          <w:lang w:val="en-US"/>
+        </w:rPr>
+        <w:t xml:space="preserve">or can download </w:t>
+      </w:r>
+      <w:r>
+        <w:rPr>
+          <w:lang w:val="en-US"/>
+        </w:rPr>
+        <w:t>(pull)</w:t>
+      </w:r>
+      <w:r>
+        <w:rPr>
+          <w:lang w:val="en-US"/>
+        </w:rPr>
+        <w:t xml:space="preserve"> a pre-build image form platforms like Docker</w:t>
+      </w:r>
+      <w:r>
+        <w:rPr>
+          <w:lang w:val="en-US"/>
+        </w:rPr>
+        <w:t xml:space="preserve"> Hub</w:t>
+      </w:r>
+      <w:r>
+        <w:rPr>
+          <w:lang w:val="en-US"/>
+        </w:rPr>
+        <w:t xml:space="preserve"> where </w:t>
+      </w:r>
+      <w:r>
+        <w:rPr>
+          <w:lang w:val="en-US"/>
+        </w:rPr>
+        <w:t>people publish images for free</w:t>
+      </w:r>
+      <w:r>
+        <w:rPr>
+          <w:lang w:val="en-US"/>
+        </w:rPr>
+        <w:t>.</w:t>
+      </w:r>
+    </w:p>
+    <w:p>
+      <w:pPr>
+        <w:rPr>
+          <w:lang w:val="en-US"/>
+        </w:rPr>
+      </w:pPr>
+      <w:r>
+        <w:rPr>
+          <w:lang w:val="en-US"/>
+        </w:rPr>
+        <w:t>The images are built upon a base image</w:t>
+      </w:r>
+      <w:r>
+        <w:rPr>
+          <w:lang w:val="en-US"/>
+        </w:rPr>
+        <w:t xml:space="preserve">. </w:t>
+      </w:r>
+      <w:r>
+        <w:rPr>
+          <w:lang w:val="en-US"/>
+        </w:rPr>
+        <w:t xml:space="preserve">Smaller base images are better as </w:t>
+      </w:r>
+      <w:r>
+        <w:rPr>
+          <w:lang w:val="en-US"/>
+        </w:rPr>
+        <w:t xml:space="preserve">they load faster. </w:t>
+      </w:r>
+      <w:hyperlink r:id="rId9" w:history="1">
+        <w:r>
+          <w:rPr>
+            <w:rStyle w:val="Hyperlink"/>
+            <w:lang w:val="en-US"/>
+          </w:rPr>
+          <w:t>https://pythonspeed.com/articles/base-image-python-docker-images/</w:t>
+        </w:r>
+      </w:hyperlink>
+    </w:p>
+    <w:p>
+      <w:pPr>
+        <w:rPr>
+          <w:lang w:val="en-US"/>
+        </w:rPr>
+      </w:pPr>
+      <w:r>
+        <w:rPr>
+          <w:lang w:val="en-US"/>
+        </w:rPr>
+        <w:t xml:space="preserve">Commands in a </w:t>
+      </w:r>
+      <w:proofErr w:type="spellStart"/>
+      <w:r>
+        <w:rPr>
+          <w:lang w:val="en-US"/>
+        </w:rPr>
+        <w:t>Dockerfile</w:t>
+      </w:r>
+      <w:proofErr w:type="spellEnd"/>
+      <w:r>
+        <w:rPr>
+          <w:lang w:val="en-US"/>
+        </w:rPr>
+        <w:t xml:space="preserve"> - </w:t>
+      </w:r>
+      <w:hyperlink r:id="rId10" w:anchor="maintainer-deprecated" w:history="1">
+        <w:r>
+          <w:rPr>
+            <w:rStyle w:val="Hyperlink"/>
+            <w:lang w:val="en-US"/>
+          </w:rPr>
+          <w:t>https://docs.docker.com/reference/dockerfile#maintainer-deprecated</w:t>
+        </w:r>
+      </w:hyperlink>
+    </w:p>
+    <w:p>
+      <w:pPr>
+        <w:rPr>
+          <w:lang w:val="en-US"/>
+        </w:rPr>
+      </w:pPr>
+      <w:r>
+        <w:rPr>
+          <w:lang w:val="en-US"/>
+        </w:rPr>
+        <w:t xml:space="preserve">Simplest way to create a </w:t>
+      </w:r>
+      <w:proofErr w:type="spellStart"/>
+      <w:r>
+        <w:rPr>
+          <w:lang w:val="en-US"/>
+        </w:rPr>
+        <w:t>Dockerfile</w:t>
+      </w:r>
+      <w:proofErr w:type="spellEnd"/>
+      <w:r>
+        <w:rPr>
+          <w:lang w:val="en-US"/>
+        </w:rPr>
+        <w:t xml:space="preserve"> </w:t>
+      </w:r>
+      <w:r>
+        <w:rPr>
+          <w:lang w:val="en-US"/>
+        </w:rPr>
+        <w:t>would be to use</w:t>
+      </w:r>
+      <w:r>
+        <w:rPr>
+          <w:lang w:val="en-US"/>
+        </w:rPr>
+        <w:t xml:space="preserve"> </w:t>
+      </w:r>
+      <w:proofErr w:type="spellStart"/>
+      <w:r>
+        <w:rPr>
+          <w:lang w:val="en-US"/>
+        </w:rPr>
+        <w:t>Seqera</w:t>
+      </w:r>
+      <w:r>
+        <w:rPr>
+          <w:lang w:val="en-US"/>
+        </w:rPr>
+        <w:t>’s</w:t>
+      </w:r>
+      <w:proofErr w:type="spellEnd"/>
+      <w:r>
+        <w:rPr>
+          <w:lang w:val="en-US"/>
+        </w:rPr>
+        <w:t xml:space="preserve"> container building tool</w:t>
+      </w:r>
+      <w:r>
+        <w:rPr>
+          <w:lang w:val="en-US"/>
+        </w:rPr>
+        <w:t xml:space="preserve"> </w:t>
+      </w:r>
+      <w:hyperlink r:id="rId11" w:history="1">
+        <w:r>
+          <w:rPr>
+            <w:rStyle w:val="Hyperlink"/>
+            <w:lang w:val="en-US"/>
+          </w:rPr>
+          <w:t>https://seqera.io/containers/</w:t>
+        </w:r>
+      </w:hyperlink>
+      <w:r>
+        <w:rPr>
+          <w:lang w:val="en-US"/>
+        </w:rPr>
+        <w:t xml:space="preserve"> </w:t>
+      </w:r>
+      <w:r>
+        <w:rPr>
+          <w:lang w:val="en-US"/>
+        </w:rPr>
+        <w:t xml:space="preserve">View build details </w:t>
+      </w:r>
+      <w:r>
+        <w:rPr>
+          <w:lang w:val="en-US"/>
+        </w:rPr>
+        <w:t xml:space="preserve">section </w:t>
+      </w:r>
+      <w:r>
+        <w:rPr>
+          <w:lang w:val="en-US"/>
+        </w:rPr>
+        <w:t xml:space="preserve">to </w:t>
+      </w:r>
+      <w:r>
+        <w:rPr>
+          <w:lang w:val="en-US"/>
+        </w:rPr>
+        <w:t xml:space="preserve">see the </w:t>
+      </w:r>
+      <w:r>
+        <w:rPr>
+          <w:lang w:val="en-US"/>
+        </w:rPr>
+        <w:t>Conda environment file</w:t>
+      </w:r>
+      <w:r>
+        <w:rPr>
+          <w:lang w:val="en-US"/>
+        </w:rPr>
+        <w:t xml:space="preserve"> and </w:t>
+      </w:r>
+      <w:r>
+        <w:rPr>
+          <w:lang w:val="en-US"/>
+        </w:rPr>
+        <w:t>Docker definition file</w:t>
+      </w:r>
+      <w:r>
+        <w:rPr>
+          <w:lang w:val="en-US"/>
+        </w:rPr>
+        <w:t>. These files can be used to build image locally.</w:t>
+      </w:r>
+    </w:p>
     <w:p>
       <w:pPr>
         <w:rPr>
@@ -26,29 +1188,39 @@
           <w:lang w:val="en-US"/>
         </w:rPr>
       </w:pPr>
-      <w:r>
-        <w:rPr>
-          <w:lang w:val="en-US"/>
-        </w:rPr>
-        <w:t>Ma</w:t>
-      </w:r>
-      <w:r>
-        <w:rPr>
-          <w:lang w:val="en-US"/>
-        </w:rPr>
-        <w:t>m</w:t>
-      </w:r>
-      <w:r>
-        <w:rPr>
-          <w:lang w:val="en-US"/>
-        </w:rPr>
-        <w:t>ba</w:t>
-      </w:r>
+      <w:proofErr w:type="spellStart"/>
+      <w:r>
+        <w:rPr>
+          <w:lang w:val="en-US"/>
+        </w:rPr>
+        <w:t>Miniconda</w:t>
+      </w:r>
+      <w:proofErr w:type="spellEnd"/>
       <w:r>
         <w:rPr>
           <w:lang w:val="en-US"/>
         </w:rPr>
         <w:t xml:space="preserve"> – </w:t>
+      </w:r>
+      <w:proofErr w:type="spellStart"/>
+      <w:r>
+        <w:rPr>
+          <w:lang w:val="en-US"/>
+        </w:rPr>
+        <w:t>conda</w:t>
+      </w:r>
+      <w:proofErr w:type="spellEnd"/>
+      <w:r>
+        <w:rPr>
+          <w:lang w:val="en-US"/>
+        </w:rPr>
+        <w:t xml:space="preserve"> with </w:t>
+      </w:r>
+      <w:r>
+        <w:rPr>
+          <w:lang w:val="en-US"/>
+        </w:rPr>
+        <w:t>limited essential packages</w:t>
       </w:r>
     </w:p>
     <w:p>
@@ -62,19 +1234,37 @@
           <w:lang w:val="en-US"/>
         </w:rPr>
       </w:pPr>
+      <w:r>
+        <w:rPr>
+          <w:lang w:val="en-US"/>
+        </w:rPr>
+        <w:t>Anaconda</w:t>
+      </w:r>
+      <w:r>
+        <w:rPr>
+          <w:lang w:val="en-US"/>
+        </w:rPr>
+        <w:t xml:space="preserve"> – </w:t>
+      </w:r>
       <w:proofErr w:type="spellStart"/>
       <w:r>
         <w:rPr>
           <w:lang w:val="en-US"/>
         </w:rPr>
-        <w:t>Miniconda</w:t>
+        <w:t>conda</w:t>
       </w:r>
       <w:proofErr w:type="spellEnd"/>
       <w:r>
         <w:rPr>
           <w:lang w:val="en-US"/>
         </w:rPr>
-        <w:t xml:space="preserve"> – limited essential packages</w:t>
+        <w:t xml:space="preserve"> with </w:t>
+      </w:r>
+      <w:r>
+        <w:rPr>
+          <w:lang w:val="en-US"/>
+        </w:rPr>
+        <w:t>extensive pre-installed packages</w:t>
       </w:r>
     </w:p>
     <w:p>
@@ -92,14 +1282,63 @@
         <w:rPr>
           <w:lang w:val="en-US"/>
         </w:rPr>
-        <w:t>Anaconda</w:t>
-      </w:r>
-      <w:r>
-        <w:rPr>
-          <w:lang w:val="en-US"/>
-        </w:rPr>
-        <w:t xml:space="preserve"> – extensive pre-installed packages</w:t>
-      </w:r>
+        <w:t>Ma</w:t>
+      </w:r>
+      <w:r>
+        <w:rPr>
+          <w:lang w:val="en-US"/>
+        </w:rPr>
+        <w:t>m</w:t>
+      </w:r>
+      <w:r>
+        <w:rPr>
+          <w:lang w:val="en-US"/>
+        </w:rPr>
+        <w:t>ba</w:t>
+      </w:r>
+      <w:r>
+        <w:rPr>
+          <w:lang w:val="en-US"/>
+        </w:rPr>
+        <w:t xml:space="preserve"> – </w:t>
+      </w:r>
+      <w:r>
+        <w:rPr>
+          <w:lang w:val="en-US"/>
+        </w:rPr>
+        <w:t>lighter</w:t>
+      </w:r>
+      <w:r>
+        <w:rPr>
+          <w:lang w:val="en-US"/>
+        </w:rPr>
+        <w:t xml:space="preserve">, </w:t>
+      </w:r>
+      <w:r>
+        <w:rPr>
+          <w:lang w:val="en-US"/>
+        </w:rPr>
+        <w:t xml:space="preserve">ultra-fast replacement </w:t>
+      </w:r>
+      <w:r>
+        <w:rPr>
+          <w:lang w:val="en-US"/>
+        </w:rPr>
+        <w:t>of</w:t>
+      </w:r>
+      <w:r>
+        <w:rPr>
+          <w:lang w:val="en-US"/>
+        </w:rPr>
+        <w:t xml:space="preserve"> the Conda</w:t>
+      </w:r>
+    </w:p>
+    <w:p>
+      <w:pPr>
+        <w:rPr>
+          <w:lang w:val="en-US"/>
+        </w:rPr>
+      </w:pPr>
     </w:p>
     <w:p>
       <w:pPr>
@@ -119,9 +1358,9 @@
           <w:noProof/>
         </w:rPr>
         <w:drawing>
-          <wp:inline distT="0" distB="0" distL="0" distR="0" wp14:anchorId="28CA4712" wp14:editId="56168641">
-            <wp:extent cx="3467210" cy="2333625"/>
-            <wp:effectExtent l="0" t="0" r="0" b="3175"/>
+          <wp:inline distT="0" distB="0" distL="0" distR="0" wp14:anchorId="6889B985" wp14:editId="32A18C45">
+            <wp:extent cx="2767021" cy="1862356"/>
+            <wp:effectExtent l="0" t="0" r="1905" b="5080"/>
             <wp:docPr id="623365038" name="Picture 1" descr="Using Miniconda encourages good environment management practices."/>
             <wp:cNvGraphicFramePr>
               <a:graphicFrameLocks xmlns:a="http://schemas.openxmlformats.org/drawingml/2006/main" noChangeAspect="1"/>
@@ -136,7 +1375,7 @@
                     </pic:cNvPicPr>
                   </pic:nvPicPr>
                   <pic:blipFill>
-                    <a:blip r:embed="rId5" cstate="print">
+                    <a:blip r:embed="rId12" cstate="print">
                       <a:extLst>
                         <a:ext uri="{28A0092B-C50C-407E-A947-70E740481C1C}">
                           <a14:useLocalDpi xmlns:a14="http://schemas.microsoft.com/office/drawing/2010/main" val="0"/>
@@ -151,7 +1390,7 @@
                   <pic:spPr bwMode="auto">
                     <a:xfrm>
                       <a:off x="0" y="0"/>
-                      <a:ext cx="3492121" cy="2350391"/>
+                      <a:ext cx="2860162" cy="1925045"/>
                     </a:xfrm>
                     <a:prstGeom prst="rect">
                       <a:avLst/>
@@ -173,15 +1412,44 @@
     </w:p>
     <w:p>
       <w:pPr>
+        <w:jc w:val="center"/>
+        <w:rPr>
+          <w:sz w:val="15"/>
+          <w:szCs w:val="15"/>
+        </w:rPr>
+      </w:pPr>
+      <w:r>
+        <w:rPr>
+          <w:sz w:val="15"/>
+          <w:szCs w:val="15"/>
+        </w:rPr>
+        <w:t xml:space="preserve">Source: </w:t>
+      </w:r>
+      <w:hyperlink r:id="rId13" w:history="1">
+        <w:r>
+          <w:rPr>
+            <w:rStyle w:val="Hyperlink"/>
+            <w:sz w:val="15"/>
+            <w:szCs w:val="15"/>
+          </w:rPr>
+          <w:t>https://medium.com/data-science/managing-project-specific-environments-with-conda-b8b50aa8be0e</w:t>
+        </w:r>
+      </w:hyperlink>
+    </w:p>
+    <w:p>
+      <w:pPr>
+        <w:jc w:val="center"/>
+      </w:pPr>
+    </w:p>
+    <w:p>
+      <w:pPr>
         <w:tabs>
           <w:tab w:val="left" w:pos="2400"/>
         </w:tabs>
       </w:pPr>
       <w:r>
-        <w:t>Conda installs programs from repositories that are called channels.</w:t>
-      </w:r>
-      <w:r>
-        <w:t xml:space="preserve"> These are remote locations from where </w:t>
+        <w:lastRenderedPageBreak/>
+        <w:t xml:space="preserve">Conda installs programs from repositories that are called channels. These are remote locations from where </w:t>
       </w:r>
       <w:proofErr w:type="spellStart"/>
       <w:r>
@@ -189,10 +1457,7 @@
       </w:r>
       <w:proofErr w:type="spellEnd"/>
       <w:r>
-        <w:t xml:space="preserve"> can fetch the packages.</w:t>
-      </w:r>
-      <w:r>
-        <w:t xml:space="preserve"> </w:t>
+        <w:t xml:space="preserve"> can fetch the packages. </w:t>
       </w:r>
     </w:p>
     <w:p>
@@ -207,13 +1472,7 @@
       </w:r>
       <w:proofErr w:type="spellEnd"/>
       <w:r>
-        <w:t xml:space="preserve"> is a channel dedicated to bioinformatics tools</w:t>
-      </w:r>
-      <w:r>
-        <w:t>/packages</w:t>
-      </w:r>
-      <w:r>
-        <w:t xml:space="preserve">. </w:t>
+        <w:t xml:space="preserve"> is a channel dedicated to bioinformatics tools/packages. </w:t>
       </w:r>
     </w:p>
     <w:p>
@@ -231,7 +1490,18 @@
       </w:r>
       <w:proofErr w:type="spellEnd"/>
       <w:r>
-        <w:t xml:space="preserve"> can be exported in a YAML file format that can be shared with others who want to recreate the same environment.  </w:t>
+        <w:t xml:space="preserve"> can be exported in a </w:t>
+      </w:r>
+      <w:r>
+        <w:t>.</w:t>
+      </w:r>
+      <w:proofErr w:type="spellStart"/>
+      <w:r>
+        <w:t>yaml</w:t>
+      </w:r>
+      <w:proofErr w:type="spellEnd"/>
+      <w:r>
+        <w:t xml:space="preserve"> file format that can be shared with others who want to recreate the same environment.  </w:t>
       </w:r>
     </w:p>
     <w:p>
@@ -239,10 +1509,1167 @@
         <w:tabs>
           <w:tab w:val="left" w:pos="2400"/>
         </w:tabs>
-        <w:rPr>
-          <w:lang w:val="en-US"/>
-        </w:rPr>
-      </w:pPr>
+      </w:pPr>
+      <w:r>
+        <w:t xml:space="preserve">$ </w:t>
+      </w:r>
+      <w:proofErr w:type="spellStart"/>
+      <w:r>
+        <w:t>conda</w:t>
+      </w:r>
+      <w:proofErr w:type="spellEnd"/>
+      <w:r>
+        <w:t xml:space="preserve"> env export</w:t>
+      </w:r>
+      <w:r>
+        <w:t xml:space="preserve"> &gt; </w:t>
+      </w:r>
+      <w:proofErr w:type="spellStart"/>
+      <w:proofErr w:type="gramStart"/>
+      <w:r>
+        <w:t>environment.yaml</w:t>
+      </w:r>
+      <w:proofErr w:type="spellEnd"/>
+      <w:proofErr w:type="gramEnd"/>
+    </w:p>
+    <w:p>
+      <w:pPr>
+        <w:tabs>
+          <w:tab w:val="left" w:pos="2400"/>
+        </w:tabs>
+      </w:pPr>
+    </w:p>
+    <w:p>
+      <w:pPr>
+        <w:rPr>
+          <w:b/>
+          <w:bCs/>
+          <w:lang w:val="en-US"/>
+        </w:rPr>
+      </w:pPr>
+      <w:r>
+        <w:rPr>
+          <w:b/>
+          <w:bCs/>
+          <w:lang w:val="en-US"/>
+        </w:rPr>
+        <w:t>Build container</w:t>
+      </w:r>
+      <w:r>
+        <w:rPr>
+          <w:b/>
+          <w:bCs/>
+          <w:lang w:val="en-US"/>
+        </w:rPr>
+        <w:t>s</w:t>
+      </w:r>
+      <w:r>
+        <w:rPr>
+          <w:b/>
+          <w:bCs/>
+          <w:lang w:val="en-US"/>
+        </w:rPr>
+        <w:t xml:space="preserve"> using </w:t>
+      </w:r>
+      <w:proofErr w:type="spellStart"/>
+      <w:r>
+        <w:rPr>
+          <w:b/>
+          <w:bCs/>
+          <w:lang w:val="en-US"/>
+        </w:rPr>
+        <w:t>Dockerfile</w:t>
+      </w:r>
+      <w:proofErr w:type="spellEnd"/>
+      <w:r>
+        <w:rPr>
+          <w:b/>
+          <w:bCs/>
+          <w:lang w:val="en-US"/>
+        </w:rPr>
+        <w:t xml:space="preserve"> </w:t>
+      </w:r>
+      <w:r>
+        <w:rPr>
+          <w:b/>
+          <w:bCs/>
+          <w:lang w:val="en-US"/>
+        </w:rPr>
+        <w:t xml:space="preserve">and </w:t>
+      </w:r>
+      <w:proofErr w:type="spellStart"/>
+      <w:r>
+        <w:rPr>
+          <w:b/>
+          <w:bCs/>
+          <w:lang w:val="en-US"/>
+        </w:rPr>
+        <w:t>environment.yml</w:t>
+      </w:r>
+      <w:proofErr w:type="spellEnd"/>
+      <w:r>
+        <w:rPr>
+          <w:b/>
+          <w:bCs/>
+          <w:lang w:val="en-US"/>
+        </w:rPr>
+        <w:t xml:space="preserve"> </w:t>
+      </w:r>
+      <w:r>
+        <w:rPr>
+          <w:b/>
+          <w:bCs/>
+          <w:lang w:val="en-US"/>
+        </w:rPr>
+        <w:t>with</w:t>
+      </w:r>
+      <w:r>
+        <w:rPr>
+          <w:b/>
+          <w:bCs/>
+          <w:lang w:val="en-US"/>
+        </w:rPr>
+        <w:t xml:space="preserve"> </w:t>
+      </w:r>
+      <w:r>
+        <w:rPr>
+          <w:b/>
+          <w:bCs/>
+          <w:lang w:val="en-US"/>
+        </w:rPr>
+        <w:t>the following command:</w:t>
+      </w:r>
+    </w:p>
+    <w:p>
+      <w:pPr>
+        <w:rPr>
+          <w:lang w:val="en-US"/>
+        </w:rPr>
+      </w:pPr>
+      <w:r>
+        <w:rPr>
+          <w:lang w:val="en-US"/>
+        </w:rPr>
+        <w:t xml:space="preserve">~$ </w:t>
+      </w:r>
+      <w:r>
+        <w:rPr>
+          <w:lang w:val="en-US"/>
+        </w:rPr>
+        <w:t xml:space="preserve">docker build -t </w:t>
+      </w:r>
+      <w:proofErr w:type="spellStart"/>
+      <w:proofErr w:type="gramStart"/>
+      <w:r>
+        <w:rPr>
+          <w:lang w:val="en-US"/>
+        </w:rPr>
+        <w:t>name:tag</w:t>
+      </w:r>
+      <w:proofErr w:type="spellEnd"/>
+      <w:proofErr w:type="gramEnd"/>
+      <w:r>
+        <w:rPr>
+          <w:lang w:val="en-US"/>
+        </w:rPr>
+        <w:t xml:space="preserve"> </w:t>
+      </w:r>
+      <w:r>
+        <w:rPr>
+          <w:lang w:val="en-US"/>
+        </w:rPr>
+        <w:t>.</w:t>
+      </w:r>
+    </w:p>
+    <w:p>
+      <w:pPr>
+        <w:rPr>
+          <w:lang w:val="en-US"/>
+        </w:rPr>
+      </w:pPr>
+      <w:r>
+        <w:rPr>
+          <w:lang w:val="en-US"/>
+        </w:rPr>
+        <w:t>-t</w:t>
+      </w:r>
+      <w:r>
+        <w:rPr>
+          <w:lang w:val="en-US"/>
+        </w:rPr>
+        <w:tab/>
+      </w:r>
+      <w:r>
+        <w:rPr>
+          <w:lang w:val="en-US"/>
+        </w:rPr>
+        <w:t xml:space="preserve">specify an image </w:t>
+      </w:r>
+      <w:proofErr w:type="spellStart"/>
+      <w:proofErr w:type="gramStart"/>
+      <w:r>
+        <w:rPr>
+          <w:lang w:val="en-US"/>
+        </w:rPr>
+        <w:t>name</w:t>
+      </w:r>
+      <w:r>
+        <w:rPr>
+          <w:lang w:val="en-US"/>
+        </w:rPr>
+        <w:t>:tag</w:t>
+      </w:r>
+      <w:proofErr w:type="spellEnd"/>
+      <w:proofErr w:type="gramEnd"/>
+      <w:r>
+        <w:rPr>
+          <w:lang w:val="en-US"/>
+        </w:rPr>
+        <w:t xml:space="preserve"> </w:t>
+      </w:r>
+      <w:r>
+        <w:rPr>
+          <w:lang w:val="en-US"/>
+        </w:rPr>
+        <w:t xml:space="preserve">(e.g. </w:t>
+      </w:r>
+      <w:r>
+        <w:rPr>
+          <w:lang w:val="en-US"/>
+        </w:rPr>
+        <w:t>cnv-</w:t>
+      </w:r>
+      <w:proofErr w:type="gramStart"/>
+      <w:r>
+        <w:rPr>
+          <w:lang w:val="en-US"/>
+        </w:rPr>
+        <w:t>robot:v</w:t>
+      </w:r>
+      <w:proofErr w:type="gramEnd"/>
+      <w:r>
+        <w:rPr>
+          <w:lang w:val="en-US"/>
+        </w:rPr>
+        <w:t>4.2</w:t>
+      </w:r>
+      <w:r>
+        <w:rPr>
+          <w:lang w:val="en-US"/>
+        </w:rPr>
+        <w:t>)</w:t>
+      </w:r>
+    </w:p>
+    <w:p>
+      <w:pPr>
+        <w:rPr>
+          <w:b/>
+          <w:bCs/>
+          <w:lang w:val="en-US"/>
+        </w:rPr>
+      </w:pPr>
+      <w:r>
+        <w:rPr>
+          <w:b/>
+          <w:bCs/>
+          <w:lang w:val="en-US"/>
+        </w:rPr>
+        <w:t>To download (pull) a container from Docker Hub</w:t>
+      </w:r>
+      <w:r>
+        <w:rPr>
+          <w:b/>
+          <w:bCs/>
+          <w:lang w:val="en-US"/>
+        </w:rPr>
+        <w:t>:</w:t>
+      </w:r>
+    </w:p>
+    <w:p>
+      <w:pPr>
+        <w:rPr>
+          <w:lang w:val="en-US"/>
+        </w:rPr>
+      </w:pPr>
+      <w:r>
+        <w:rPr>
+          <w:lang w:val="en-US"/>
+        </w:rPr>
+        <w:t xml:space="preserve">~$ </w:t>
+      </w:r>
+      <w:r>
+        <w:rPr>
+          <w:lang w:val="en-US"/>
+        </w:rPr>
+        <w:t xml:space="preserve">docker pull </w:t>
+      </w:r>
+      <w:proofErr w:type="spellStart"/>
+      <w:r>
+        <w:rPr>
+          <w:lang w:val="en-US"/>
+        </w:rPr>
+        <w:t>ankurtchuzy</w:t>
+      </w:r>
+      <w:proofErr w:type="spellEnd"/>
+      <w:r>
+        <w:rPr>
+          <w:lang w:val="en-US"/>
+        </w:rPr>
+        <w:t>/cnv-robot-docker-</w:t>
+      </w:r>
+      <w:proofErr w:type="gramStart"/>
+      <w:r>
+        <w:rPr>
+          <w:lang w:val="en-US"/>
+        </w:rPr>
+        <w:t>dev:v</w:t>
+      </w:r>
+      <w:proofErr w:type="gramEnd"/>
+      <w:r>
+        <w:rPr>
+          <w:lang w:val="en-US"/>
+        </w:rPr>
+        <w:t>4.2</w:t>
+      </w:r>
+    </w:p>
+    <w:p>
+      <w:pPr>
+        <w:rPr>
+          <w:b/>
+          <w:bCs/>
+          <w:lang w:val="en-US"/>
+        </w:rPr>
+      </w:pPr>
+      <w:r>
+        <w:rPr>
+          <w:b/>
+          <w:bCs/>
+          <w:lang w:val="en-US"/>
+        </w:rPr>
+        <w:t xml:space="preserve">To see the list of images </w:t>
+      </w:r>
+      <w:r>
+        <w:rPr>
+          <w:b/>
+          <w:bCs/>
+          <w:lang w:val="en-US"/>
+        </w:rPr>
+        <w:t>built</w:t>
+      </w:r>
+      <w:r>
+        <w:rPr>
+          <w:b/>
+          <w:bCs/>
+          <w:lang w:val="en-US"/>
+        </w:rPr>
+        <w:t>/</w:t>
+      </w:r>
+      <w:r>
+        <w:rPr>
+          <w:b/>
+          <w:bCs/>
+          <w:lang w:val="en-US"/>
+        </w:rPr>
+        <w:t>pulled from Docker Hub</w:t>
+      </w:r>
+      <w:r>
+        <w:rPr>
+          <w:b/>
+          <w:bCs/>
+          <w:lang w:val="en-US"/>
+        </w:rPr>
+        <w:t>:</w:t>
+      </w:r>
+    </w:p>
+    <w:p>
+      <w:pPr>
+        <w:rPr>
+          <w:lang w:val="en-US"/>
+        </w:rPr>
+      </w:pPr>
+      <w:r>
+        <w:rPr>
+          <w:lang w:val="en-US"/>
+        </w:rPr>
+        <w:t xml:space="preserve">~$ </w:t>
+      </w:r>
+      <w:r>
+        <w:rPr>
+          <w:lang w:val="en-US"/>
+        </w:rPr>
+        <w:t>docker images</w:t>
+      </w:r>
+    </w:p>
+    <w:p>
+      <w:pPr>
+        <w:rPr>
+          <w:b/>
+          <w:bCs/>
+          <w:lang w:val="en-US"/>
+        </w:rPr>
+      </w:pPr>
+      <w:r>
+        <w:rPr>
+          <w:b/>
+          <w:bCs/>
+          <w:lang w:val="en-US"/>
+        </w:rPr>
+        <w:t xml:space="preserve">To </w:t>
+      </w:r>
+      <w:r>
+        <w:rPr>
+          <w:b/>
+          <w:bCs/>
+          <w:lang w:val="en-US"/>
+        </w:rPr>
+        <w:t>see how a container was constructed:</w:t>
+      </w:r>
+    </w:p>
+    <w:p>
+      <w:pPr>
+        <w:rPr>
+          <w:lang w:val="en-US"/>
+        </w:rPr>
+      </w:pPr>
+      <w:r>
+        <w:rPr>
+          <w:lang w:val="en-US"/>
+        </w:rPr>
+        <w:t xml:space="preserve">~$ </w:t>
+      </w:r>
+      <w:r>
+        <w:rPr>
+          <w:lang w:val="en-US"/>
+        </w:rPr>
+        <w:t xml:space="preserve">docker history </w:t>
+      </w:r>
+      <w:r>
+        <w:rPr>
+          <w:lang w:val="en-US"/>
+        </w:rPr>
+        <w:t>&lt;</w:t>
+      </w:r>
+      <w:proofErr w:type="spellStart"/>
+      <w:r>
+        <w:rPr>
+          <w:lang w:val="en-US"/>
+        </w:rPr>
+        <w:t>container</w:t>
+      </w:r>
+      <w:r>
+        <w:rPr>
+          <w:lang w:val="en-US"/>
+        </w:rPr>
+        <w:t>_name</w:t>
+      </w:r>
+      <w:proofErr w:type="spellEnd"/>
+      <w:r>
+        <w:rPr>
+          <w:lang w:val="en-US"/>
+        </w:rPr>
+        <w:t>&gt;</w:t>
+      </w:r>
+    </w:p>
+    <w:p>
+      <w:pPr>
+        <w:rPr>
+          <w:b/>
+          <w:bCs/>
+          <w:lang w:val="en-US"/>
+        </w:rPr>
+      </w:pPr>
+    </w:p>
+    <w:p>
+      <w:pPr>
+        <w:rPr>
+          <w:b/>
+          <w:bCs/>
+          <w:lang w:val="en-US"/>
+        </w:rPr>
+      </w:pPr>
+      <w:r>
+        <w:rPr>
+          <w:b/>
+          <w:bCs/>
+          <w:lang w:val="en-US"/>
+        </w:rPr>
+        <w:t>Using a container interactively</w:t>
+      </w:r>
+      <w:r>
+        <w:rPr>
+          <w:b/>
+          <w:bCs/>
+          <w:lang w:val="en-US"/>
+        </w:rPr>
+        <w:t>:</w:t>
+      </w:r>
+    </w:p>
+    <w:p>
+      <w:pPr>
+        <w:rPr>
+          <w:lang w:val="en-US"/>
+        </w:rPr>
+      </w:pPr>
+      <w:r>
+        <w:rPr>
+          <w:lang w:val="en-US"/>
+        </w:rPr>
+        <w:t xml:space="preserve">~$ </w:t>
+      </w:r>
+      <w:r>
+        <w:rPr>
+          <w:lang w:val="en-US"/>
+        </w:rPr>
+        <w:t xml:space="preserve">docker run -it </w:t>
+      </w:r>
+      <w:r>
+        <w:rPr>
+          <w:lang w:val="en-US"/>
+        </w:rPr>
+        <w:t>&lt;image name&gt;</w:t>
+      </w:r>
+      <w:r>
+        <w:rPr>
+          <w:lang w:val="en-US"/>
+        </w:rPr>
+        <w:t xml:space="preserve"> bash</w:t>
+      </w:r>
+    </w:p>
+    <w:p>
+      <w:pPr>
+        <w:rPr>
+          <w:lang w:val="en-US"/>
+        </w:rPr>
+      </w:pPr>
+      <w:r>
+        <w:rPr>
+          <w:lang w:val="en-US"/>
+        </w:rPr>
+        <w:t>-</w:t>
+      </w:r>
+      <w:proofErr w:type="spellStart"/>
+      <w:r>
+        <w:rPr>
+          <w:lang w:val="en-US"/>
+        </w:rPr>
+        <w:t>i</w:t>
+      </w:r>
+      <w:proofErr w:type="spellEnd"/>
+      <w:r>
+        <w:rPr>
+          <w:lang w:val="en-US"/>
+        </w:rPr>
+        <w:tab/>
+      </w:r>
+      <w:r>
+        <w:rPr>
+          <w:lang w:val="en-US"/>
+        </w:rPr>
+        <w:t>run the container interactively</w:t>
+      </w:r>
+    </w:p>
+    <w:p>
+      <w:pPr>
+        <w:rPr>
+          <w:lang w:val="en-US"/>
+        </w:rPr>
+      </w:pPr>
+      <w:r>
+        <w:rPr>
+          <w:lang w:val="en-US"/>
+        </w:rPr>
+        <w:t>-t</w:t>
+      </w:r>
+      <w:r>
+        <w:rPr>
+          <w:lang w:val="en-US"/>
+        </w:rPr>
+        <w:tab/>
+      </w:r>
+      <w:r>
+        <w:rPr>
+          <w:lang w:val="en-US"/>
+        </w:rPr>
+        <w:t xml:space="preserve">allocate a </w:t>
+      </w:r>
+      <w:proofErr w:type="spellStart"/>
+      <w:r>
+        <w:rPr>
+          <w:lang w:val="en-US"/>
+        </w:rPr>
+        <w:t>tty</w:t>
+      </w:r>
+      <w:proofErr w:type="spellEnd"/>
+      <w:r>
+        <w:rPr>
+          <w:lang w:val="en-US"/>
+        </w:rPr>
+        <w:t xml:space="preserve"> </w:t>
+      </w:r>
+      <w:r>
+        <w:rPr>
+          <w:lang w:val="en-US"/>
+        </w:rPr>
+        <w:t>to</w:t>
+      </w:r>
+      <w:r>
+        <w:rPr>
+          <w:lang w:val="en-US"/>
+        </w:rPr>
+        <w:t xml:space="preserve"> interact with the container from command line</w:t>
+      </w:r>
+    </w:p>
+    <w:p>
+      <w:pPr>
+        <w:rPr>
+          <w:lang w:val="en-US"/>
+        </w:rPr>
+      </w:pPr>
+      <w:r>
+        <w:rPr>
+          <w:lang w:val="en-US"/>
+        </w:rPr>
+        <w:t>bash</w:t>
+      </w:r>
+      <w:r>
+        <w:rPr>
+          <w:lang w:val="en-US"/>
+        </w:rPr>
+        <w:tab/>
+      </w:r>
+      <w:r>
+        <w:rPr>
+          <w:lang w:val="en-US"/>
+        </w:rPr>
+        <w:t>start a bash shell in</w:t>
+      </w:r>
+      <w:r>
+        <w:rPr>
+          <w:lang w:val="en-US"/>
+        </w:rPr>
+        <w:t>side</w:t>
+      </w:r>
+      <w:r>
+        <w:rPr>
+          <w:lang w:val="en-US"/>
+        </w:rPr>
+        <w:t xml:space="preserve"> the container</w:t>
+      </w:r>
+    </w:p>
+    <w:p>
+      <w:pPr>
+        <w:rPr>
+          <w:lang w:val="en-US"/>
+        </w:rPr>
+      </w:pPr>
+      <w:r>
+        <w:rPr>
+          <w:lang w:val="en-US"/>
+        </w:rPr>
+        <w:t>T</w:t>
+      </w:r>
+      <w:r>
+        <w:rPr>
+          <w:lang w:val="en-US"/>
+        </w:rPr>
+        <w:t xml:space="preserve">ype </w:t>
+      </w:r>
+      <w:r>
+        <w:rPr>
+          <w:lang w:val="en-US"/>
+        </w:rPr>
+        <w:t>exit</w:t>
+      </w:r>
+      <w:r>
+        <w:rPr>
+          <w:lang w:val="en-US"/>
+        </w:rPr>
+        <w:t xml:space="preserve"> </w:t>
+      </w:r>
+      <w:r>
+        <w:rPr>
+          <w:lang w:val="en-US"/>
+        </w:rPr>
+        <w:t xml:space="preserve">from the shell </w:t>
+      </w:r>
+      <w:r>
+        <w:rPr>
+          <w:lang w:val="en-US"/>
+        </w:rPr>
+        <w:t xml:space="preserve">to </w:t>
+      </w:r>
+      <w:r>
+        <w:rPr>
+          <w:lang w:val="en-US"/>
+        </w:rPr>
+        <w:t xml:space="preserve">exit </w:t>
+      </w:r>
+      <w:r>
+        <w:rPr>
+          <w:lang w:val="en-US"/>
+        </w:rPr>
+        <w:t>the container</w:t>
+      </w:r>
+      <w:r>
+        <w:rPr>
+          <w:lang w:val="en-US"/>
+        </w:rPr>
+        <w:t>.</w:t>
+      </w:r>
+    </w:p>
+    <w:p>
+      <w:pPr>
+        <w:rPr>
+          <w:b/>
+          <w:bCs/>
+          <w:lang w:val="en-US"/>
+        </w:rPr>
+      </w:pPr>
+    </w:p>
+    <w:p>
+      <w:pPr>
+        <w:pStyle w:val="Heading1"/>
+        <w:rPr>
+          <w:lang w:val="en-US"/>
+        </w:rPr>
+      </w:pPr>
+      <w:r>
+        <w:rPr>
+          <w:lang w:val="en-US"/>
+        </w:rPr>
+        <w:t>Publishing</w:t>
+      </w:r>
+      <w:r>
+        <w:rPr>
+          <w:lang w:val="en-US"/>
+        </w:rPr>
+        <w:t xml:space="preserve"> a container to registry</w:t>
+      </w:r>
+    </w:p>
+    <w:p>
+      <w:pPr>
+        <w:rPr>
+          <w:b/>
+          <w:bCs/>
+          <w:lang w:val="en-US"/>
+        </w:rPr>
+      </w:pPr>
+      <w:r>
+        <w:rPr>
+          <w:b/>
+          <w:bCs/>
+          <w:lang w:val="en-US"/>
+        </w:rPr>
+        <w:t xml:space="preserve">Follow these </w:t>
+      </w:r>
+      <w:r>
+        <w:rPr>
+          <w:b/>
+          <w:bCs/>
+          <w:lang w:val="en-US"/>
+        </w:rPr>
+        <w:t>steps</w:t>
+      </w:r>
+      <w:r>
+        <w:rPr>
+          <w:b/>
+          <w:bCs/>
+          <w:lang w:val="en-US"/>
+        </w:rPr>
+        <w:t xml:space="preserve"> to build and publish </w:t>
+      </w:r>
+      <w:r>
+        <w:rPr>
+          <w:b/>
+          <w:bCs/>
+          <w:lang w:val="en-US"/>
+        </w:rPr>
+        <w:t>a container on Docker Hub:</w:t>
+      </w:r>
+    </w:p>
+    <w:p>
+      <w:pPr>
+        <w:pStyle w:val="ListParagraph"/>
+        <w:numPr>
+          <w:ilvl w:val="0"/>
+          <w:numId w:val="8"/>
+        </w:numPr>
+        <w:rPr>
+          <w:lang w:val="en-US"/>
+        </w:rPr>
+      </w:pPr>
+      <w:r>
+        <w:rPr>
+          <w:lang w:val="en-US"/>
+        </w:rPr>
+        <w:t>Create a profile on Docker Hub</w:t>
+      </w:r>
+      <w:r>
+        <w:rPr>
+          <w:lang w:val="en-US"/>
+        </w:rPr>
+        <w:t xml:space="preserve"> - </w:t>
+      </w:r>
+      <w:hyperlink r:id="rId14" w:history="1">
+        <w:r>
+          <w:rPr>
+            <w:rStyle w:val="Hyperlink"/>
+            <w:lang w:val="en-US"/>
+          </w:rPr>
+          <w:t>https://hub.docker.com</w:t>
+        </w:r>
+      </w:hyperlink>
+    </w:p>
+    <w:p>
+      <w:pPr>
+        <w:pStyle w:val="ListParagraph"/>
+        <w:numPr>
+          <w:ilvl w:val="0"/>
+          <w:numId w:val="8"/>
+        </w:numPr>
+        <w:rPr>
+          <w:lang w:val="en-US"/>
+        </w:rPr>
+      </w:pPr>
+      <w:r>
+        <w:rPr>
+          <w:lang w:val="en-US"/>
+        </w:rPr>
+        <w:lastRenderedPageBreak/>
+        <w:t xml:space="preserve">Install Docker on your system </w:t>
+      </w:r>
+    </w:p>
+    <w:p>
+      <w:pPr>
+        <w:pStyle w:val="ListParagraph"/>
+        <w:rPr>
+          <w:lang w:val="en-US"/>
+        </w:rPr>
+      </w:pPr>
+      <w:r>
+        <w:rPr>
+          <w:lang w:val="en-US"/>
+        </w:rPr>
+        <w:t xml:space="preserve">Mac: </w:t>
+      </w:r>
+      <w:hyperlink r:id="rId15" w:history="1">
+        <w:r>
+          <w:rPr>
+            <w:rStyle w:val="Hyperlink"/>
+            <w:lang w:val="en-US"/>
+          </w:rPr>
+          <w:t>https://docs.docker.com/desktop/setup/install/mac-install/</w:t>
+        </w:r>
+      </w:hyperlink>
+    </w:p>
+    <w:p>
+      <w:pPr>
+        <w:pStyle w:val="ListParagraph"/>
+        <w:rPr>
+          <w:lang w:val="en-US"/>
+        </w:rPr>
+      </w:pPr>
+      <w:r>
+        <w:rPr>
+          <w:lang w:val="en-US"/>
+        </w:rPr>
+        <w:t xml:space="preserve">Linux: </w:t>
+      </w:r>
+      <w:hyperlink r:id="rId16" w:history="1">
+        <w:r>
+          <w:rPr>
+            <w:rStyle w:val="Hyperlink"/>
+            <w:lang w:val="en-US"/>
+          </w:rPr>
+          <w:t>https://docs.docker.com/desktop/setup/install/linux/</w:t>
+        </w:r>
+      </w:hyperlink>
+    </w:p>
+    <w:p>
+      <w:pPr>
+        <w:pStyle w:val="ListParagraph"/>
+        <w:numPr>
+          <w:ilvl w:val="0"/>
+          <w:numId w:val="8"/>
+        </w:numPr>
+        <w:rPr>
+          <w:lang w:val="en-US"/>
+        </w:rPr>
+      </w:pPr>
+      <w:r>
+        <w:rPr>
+          <w:lang w:val="en-US"/>
+        </w:rPr>
+        <w:t xml:space="preserve">Login to </w:t>
+      </w:r>
+      <w:r>
+        <w:rPr>
+          <w:lang w:val="en-US"/>
+        </w:rPr>
+        <w:t xml:space="preserve">Docker Hub on command line </w:t>
+      </w:r>
+    </w:p>
+    <w:p>
+      <w:pPr>
+        <w:pStyle w:val="ListParagraph"/>
+        <w:rPr>
+          <w:lang w:val="en-US"/>
+        </w:rPr>
+      </w:pPr>
+      <w:r>
+        <w:rPr>
+          <w:lang w:val="en-US"/>
+        </w:rPr>
+        <w:t>~$ docker login</w:t>
+      </w:r>
+    </w:p>
+    <w:p>
+      <w:pPr>
+        <w:pStyle w:val="ListParagraph"/>
+        <w:numPr>
+          <w:ilvl w:val="0"/>
+          <w:numId w:val="8"/>
+        </w:numPr>
+        <w:rPr>
+          <w:lang w:val="en-US"/>
+        </w:rPr>
+      </w:pPr>
+      <w:r>
+        <w:rPr>
+          <w:lang w:val="en-US"/>
+        </w:rPr>
+        <w:t xml:space="preserve">Build image </w:t>
+      </w:r>
+    </w:p>
+    <w:p>
+      <w:pPr>
+        <w:pStyle w:val="ListParagraph"/>
+        <w:rPr>
+          <w:lang w:val="en-US"/>
+        </w:rPr>
+      </w:pPr>
+      <w:r>
+        <w:rPr>
+          <w:lang w:val="en-US"/>
+        </w:rPr>
+        <w:t xml:space="preserve">~$ docker build -t </w:t>
+      </w:r>
+      <w:proofErr w:type="spellStart"/>
+      <w:r>
+        <w:rPr>
+          <w:lang w:val="en-US"/>
+        </w:rPr>
+        <w:t>user</w:t>
+      </w:r>
+      <w:r>
+        <w:rPr>
+          <w:lang w:val="en-US"/>
+        </w:rPr>
+        <w:t>_</w:t>
+      </w:r>
+      <w:r>
+        <w:rPr>
+          <w:lang w:val="en-US"/>
+        </w:rPr>
+        <w:t>name</w:t>
+      </w:r>
+      <w:proofErr w:type="spellEnd"/>
+      <w:r>
+        <w:rPr>
+          <w:lang w:val="en-US"/>
+        </w:rPr>
+        <w:t>/repository</w:t>
+      </w:r>
+      <w:r>
+        <w:rPr>
+          <w:lang w:val="en-US"/>
+        </w:rPr>
+        <w:t>_</w:t>
+      </w:r>
+      <w:proofErr w:type="gramStart"/>
+      <w:r>
+        <w:rPr>
+          <w:lang w:val="en-US"/>
+        </w:rPr>
+        <w:t>name</w:t>
+      </w:r>
+      <w:r>
+        <w:rPr>
+          <w:lang w:val="en-US"/>
+        </w:rPr>
+        <w:t>:</w:t>
+      </w:r>
+      <w:r>
+        <w:rPr>
+          <w:lang w:val="en-US"/>
+        </w:rPr>
+        <w:t>v</w:t>
+      </w:r>
+      <w:proofErr w:type="gramEnd"/>
+      <w:r>
+        <w:rPr>
+          <w:lang w:val="en-US"/>
+        </w:rPr>
+        <w:t>0</w:t>
+      </w:r>
+      <w:r>
+        <w:rPr>
+          <w:lang w:val="en-US"/>
+        </w:rPr>
+        <w:t>.</w:t>
+      </w:r>
+      <w:proofErr w:type="gramStart"/>
+      <w:r>
+        <w:rPr>
+          <w:lang w:val="en-US"/>
+        </w:rPr>
+        <w:t>0</w:t>
+      </w:r>
+      <w:r>
+        <w:rPr>
+          <w:lang w:val="en-US"/>
+        </w:rPr>
+        <w:t xml:space="preserve"> .</w:t>
+      </w:r>
+      <w:proofErr w:type="gramEnd"/>
+    </w:p>
+    <w:p>
+      <w:pPr>
+        <w:pStyle w:val="ListParagraph"/>
+        <w:rPr>
+          <w:lang w:val="en-US"/>
+        </w:rPr>
+      </w:pPr>
+      <w:r>
+        <w:rPr>
+          <w:lang w:val="en-US"/>
+        </w:rPr>
+        <w:t>(</w:t>
+      </w:r>
+      <w:proofErr w:type="spellStart"/>
+      <w:r>
+        <w:rPr>
+          <w:lang w:val="en-US"/>
+        </w:rPr>
+        <w:t>Docker</w:t>
+      </w:r>
+      <w:r>
+        <w:rPr>
+          <w:lang w:val="en-US"/>
+        </w:rPr>
+        <w:t>file</w:t>
+      </w:r>
+      <w:proofErr w:type="spellEnd"/>
+      <w:r>
+        <w:rPr>
+          <w:lang w:val="en-US"/>
+        </w:rPr>
+        <w:t xml:space="preserve"> and </w:t>
+      </w:r>
+      <w:proofErr w:type="spellStart"/>
+      <w:r>
+        <w:rPr>
+          <w:lang w:val="en-US"/>
+        </w:rPr>
+        <w:t>environment.yml</w:t>
+      </w:r>
+      <w:proofErr w:type="spellEnd"/>
+      <w:r>
+        <w:rPr>
+          <w:lang w:val="en-US"/>
+        </w:rPr>
+        <w:t xml:space="preserve"> should be in </w:t>
+      </w:r>
+      <w:r>
+        <w:rPr>
+          <w:lang w:val="en-US"/>
+        </w:rPr>
+        <w:t>the same directory</w:t>
+      </w:r>
+      <w:r>
+        <w:rPr>
+          <w:lang w:val="en-US"/>
+        </w:rPr>
+        <w:t>)</w:t>
+      </w:r>
+    </w:p>
+    <w:p>
+      <w:pPr>
+        <w:pStyle w:val="ListParagraph"/>
+        <w:numPr>
+          <w:ilvl w:val="0"/>
+          <w:numId w:val="8"/>
+        </w:numPr>
+        <w:rPr>
+          <w:lang w:val="en-US"/>
+        </w:rPr>
+      </w:pPr>
+      <w:r>
+        <w:rPr>
+          <w:lang w:val="en-US"/>
+        </w:rPr>
+        <w:t>Push to Docker Hub</w:t>
+      </w:r>
+    </w:p>
+    <w:p>
+      <w:pPr>
+        <w:pStyle w:val="ListParagraph"/>
+        <w:rPr>
+          <w:lang w:val="en-US"/>
+        </w:rPr>
+      </w:pPr>
+      <w:r>
+        <w:rPr>
+          <w:lang w:val="en-US"/>
+        </w:rPr>
+        <w:t>~$</w:t>
+      </w:r>
+      <w:r>
+        <w:rPr>
+          <w:lang w:val="en-US"/>
+        </w:rPr>
+        <w:t xml:space="preserve"> docker push </w:t>
+      </w:r>
+      <w:proofErr w:type="spellStart"/>
+      <w:r>
+        <w:rPr>
+          <w:lang w:val="en-US"/>
+        </w:rPr>
+        <w:t>user_name</w:t>
+      </w:r>
+      <w:proofErr w:type="spellEnd"/>
+      <w:r>
+        <w:rPr>
+          <w:lang w:val="en-US"/>
+        </w:rPr>
+        <w:t>/repository_</w:t>
+      </w:r>
+      <w:proofErr w:type="gramStart"/>
+      <w:r>
+        <w:rPr>
+          <w:lang w:val="en-US"/>
+        </w:rPr>
+        <w:t>name:v</w:t>
+      </w:r>
+      <w:proofErr w:type="gramEnd"/>
+      <w:r>
+        <w:rPr>
+          <w:lang w:val="en-US"/>
+        </w:rPr>
+        <w:t>0</w:t>
+      </w:r>
+      <w:r>
+        <w:rPr>
+          <w:lang w:val="en-US"/>
+        </w:rPr>
+        <w:t>.</w:t>
+      </w:r>
+      <w:r>
+        <w:rPr>
+          <w:lang w:val="en-US"/>
+        </w:rPr>
+        <w:t>0</w:t>
+      </w:r>
     </w:p>
     <w:sectPr>
       <w:pgSz w:w="11906" w:h="16838"/>
@@ -257,6 +2684,208 @@
 <file path=word/numbering.xml><?xml version="1.0" encoding="utf-8"?>
 <w:numbering xmlns:wpc="http://schemas.microsoft.com/office/word/2010/wordprocessingCanvas" xmlns:cx="http://schemas.microsoft.com/office/drawing/2014/chartex" xmlns:cx1="http://schemas.microsoft.com/office/drawing/2015/9/8/chartex" xmlns:cx2="http://schemas.microsoft.com/office/drawing/2015/10/21/chartex" xmlns:cx3="http://schemas.microsoft.com/office/drawing/2016/5/9/chartex" xmlns:cx4="http://schemas.microsoft.com/office/drawing/2016/5/10/chartex" xmlns:cx5="http://schemas.microsoft.com/office/drawing/2016/5/11/chartex" xmlns:cx6="http://schemas.microsoft.com/office/drawing/2016/5/12/chartex" xmlns:cx7="http://schemas.microsoft.com/office/drawing/2016/5/13/chartex" xmlns:cx8="http://schemas.microsoft.com/office/drawing/2016/5/14/chartex" xmlns:mc="http://schemas.openxmlformats.org/markup-compatibility/2006" xmlns:m="http://schemas.openxmlformats.org/officeDocument/2006/math" xmlns:aink="http://schemas.microsoft.com/office/drawing/2016/ink" xmlns:am3d="http://schemas.microsoft.com/office/drawing/2017/model3d" xmlns:oel="http://schemas.microsoft.com/office/2019/extlst" xmlns:r="http://schemas.openxmlformats.org/officeDocument/2006/relationships" xmlns:wp14="http://schemas.microsoft.com/office/word/2010/wordprocessingDrawing" xmlns:wp="http://schemas.openxmlformats.org/drawingml/2006/wordprocessingDrawing" xmlns:wpg="http://schemas.microsoft.com/office/word/2010/wordprocessingGroup" xmlns:wpi="http://schemas.microsoft.com/office/word/2010/wordprocessingInk" xmlns:wps="http://schemas.microsoft.com/office/word/2010/wordprocessingShape" xmlns:o="urn:schemas-microsoft-com:office:office" xmlns:v="urn:schemas-microsoft-com:vml" xmlns:w10="urn:schemas-microsoft-com:office:word" xmlns:w="http://schemas.openxmlformats.org/wordprocessingml/2006/main" xmlns:w14="http://schemas.microsoft.com/office/word/2010/wordml" xmlns:w15="http://schemas.microsoft.com/office/word/2012/wordml" xmlns:w16cex="http://schemas.microsoft.com/office/word/2018/wordml/cex" xmlns:w16cid="http://schemas.microsoft.com/office/word/2016/wordml/cid" xmlns:w16="http://schemas.microsoft.com/office/word/2018/wordml" xmlns:w16sdtdh="http://schemas.microsoft.com/office/word/2020/wordml/sdtdatahash" xmlns:w16sdtfl="http://schemas.microsoft.com/office/word/2024/wordml/sdtformatlock" xmlns:w16se="http://schemas.microsoft.com/office/word/2015/wordml/symex" xmlns:w16du="http://schemas.microsoft.com/office/word/2023/wordml/word16du" xmlns:wne="http://schemas.microsoft.com/office/word/2006/wordml" mc:Ignorable="w14 w15 w16se w16cid w16 w16cex w16sdtdh w16sdtfl w16du wp14">
   <w:abstractNum w:abstractNumId="0" w15:restartNumberingAfterBreak="0">
+    <w:nsid w:val="05956504"/>
+    <w:multiLevelType w:val="hybridMultilevel"/>
+    <w:tmpl w:val="0844977E"/>
+    <w:lvl w:ilvl="0" w:tplc="0809000F">
+      <w:start w:val="1"/>
+      <w:numFmt w:val="decimal"/>
+      <w:lvlText w:val="%1."/>
+      <w:lvlJc w:val="left"/>
+      <w:pPr>
+        <w:ind w:left="720" w:hanging="360"/>
+      </w:pPr>
+      <w:rPr>
+        <w:rFonts w:hint="default"/>
+      </w:rPr>
+    </w:lvl>
+    <w:lvl w:ilvl="1" w:tplc="08090019" w:tentative="1">
+      <w:start w:val="1"/>
+      <w:numFmt w:val="lowerLetter"/>
+      <w:lvlText w:val="%2."/>
+      <w:lvlJc w:val="left"/>
+      <w:pPr>
+        <w:ind w:left="1440" w:hanging="360"/>
+      </w:pPr>
+    </w:lvl>
+    <w:lvl w:ilvl="2" w:tplc="0809001B" w:tentative="1">
+      <w:start w:val="1"/>
+      <w:numFmt w:val="lowerRoman"/>
+      <w:lvlText w:val="%3."/>
+      <w:lvlJc w:val="right"/>
+      <w:pPr>
+        <w:ind w:left="2160" w:hanging="180"/>
+      </w:pPr>
+    </w:lvl>
+    <w:lvl w:ilvl="3" w:tplc="0809000F" w:tentative="1">
+      <w:start w:val="1"/>
+      <w:numFmt w:val="decimal"/>
+      <w:lvlText w:val="%4."/>
+      <w:lvlJc w:val="left"/>
+      <w:pPr>
+        <w:ind w:left="2880" w:hanging="360"/>
+      </w:pPr>
+    </w:lvl>
+    <w:lvl w:ilvl="4" w:tplc="08090019" w:tentative="1">
+      <w:start w:val="1"/>
+      <w:numFmt w:val="lowerLetter"/>
+      <w:lvlText w:val="%5."/>
+      <w:lvlJc w:val="left"/>
+      <w:pPr>
+        <w:ind w:left="3600" w:hanging="360"/>
+      </w:pPr>
+    </w:lvl>
+    <w:lvl w:ilvl="5" w:tplc="0809001B" w:tentative="1">
+      <w:start w:val="1"/>
+      <w:numFmt w:val="lowerRoman"/>
+      <w:lvlText w:val="%6."/>
+      <w:lvlJc w:val="right"/>
+      <w:pPr>
+        <w:ind w:left="4320" w:hanging="180"/>
+      </w:pPr>
+    </w:lvl>
+    <w:lvl w:ilvl="6" w:tplc="0809000F" w:tentative="1">
+      <w:start w:val="1"/>
+      <w:numFmt w:val="decimal"/>
+      <w:lvlText w:val="%7."/>
+      <w:lvlJc w:val="left"/>
+      <w:pPr>
+        <w:ind w:left="5040" w:hanging="360"/>
+      </w:pPr>
+    </w:lvl>
+    <w:lvl w:ilvl="7" w:tplc="08090019" w:tentative="1">
+      <w:start w:val="1"/>
+      <w:numFmt w:val="lowerLetter"/>
+      <w:lvlText w:val="%8."/>
+      <w:lvlJc w:val="left"/>
+      <w:pPr>
+        <w:ind w:left="5760" w:hanging="360"/>
+      </w:pPr>
+    </w:lvl>
+    <w:lvl w:ilvl="8" w:tplc="0809001B" w:tentative="1">
+      <w:start w:val="1"/>
+      <w:numFmt w:val="lowerRoman"/>
+      <w:lvlText w:val="%9."/>
+      <w:lvlJc w:val="right"/>
+      <w:pPr>
+        <w:ind w:left="6480" w:hanging="180"/>
+      </w:pPr>
+    </w:lvl>
+  </w:abstractNum>
+  <w:abstractNum w:abstractNumId="1" w15:restartNumberingAfterBreak="0">
+    <w:nsid w:val="20EC30F3"/>
+    <w:multiLevelType w:val="hybridMultilevel"/>
+    <w:tmpl w:val="32FC4860"/>
+    <w:lvl w:ilvl="0" w:tplc="08090001">
+      <w:start w:val="1"/>
+      <w:numFmt w:val="bullet"/>
+      <w:lvlText w:val=""/>
+      <w:lvlJc w:val="left"/>
+      <w:pPr>
+        <w:ind w:left="720" w:hanging="360"/>
+      </w:pPr>
+      <w:rPr>
+        <w:rFonts w:ascii="Symbol" w:hAnsi="Symbol" w:hint="default"/>
+      </w:rPr>
+    </w:lvl>
+    <w:lvl w:ilvl="1" w:tplc="08090003" w:tentative="1">
+      <w:start w:val="1"/>
+      <w:numFmt w:val="bullet"/>
+      <w:lvlText w:val="o"/>
+      <w:lvlJc w:val="left"/>
+      <w:pPr>
+        <w:ind w:left="1440" w:hanging="360"/>
+      </w:pPr>
+      <w:rPr>
+        <w:rFonts w:ascii="Courier New" w:hAnsi="Courier New" w:cs="Courier New" w:hint="default"/>
+      </w:rPr>
+    </w:lvl>
+    <w:lvl w:ilvl="2" w:tplc="08090005" w:tentative="1">
+      <w:start w:val="1"/>
+      <w:numFmt w:val="bullet"/>
+      <w:lvlText w:val=""/>
+      <w:lvlJc w:val="left"/>
+      <w:pPr>
+        <w:ind w:left="2160" w:hanging="360"/>
+      </w:pPr>
+      <w:rPr>
+        <w:rFonts w:ascii="Wingdings" w:hAnsi="Wingdings" w:hint="default"/>
+      </w:rPr>
+    </w:lvl>
+    <w:lvl w:ilvl="3" w:tplc="08090001" w:tentative="1">
+      <w:start w:val="1"/>
+      <w:numFmt w:val="bullet"/>
+      <w:lvlText w:val=""/>
+      <w:lvlJc w:val="left"/>
+      <w:pPr>
+        <w:ind w:left="2880" w:hanging="360"/>
+      </w:pPr>
+      <w:rPr>
+        <w:rFonts w:ascii="Symbol" w:hAnsi="Symbol" w:hint="default"/>
+      </w:rPr>
+    </w:lvl>
+    <w:lvl w:ilvl="4" w:tplc="08090003" w:tentative="1">
+      <w:start w:val="1"/>
+      <w:numFmt w:val="bullet"/>
+      <w:lvlText w:val="o"/>
+      <w:lvlJc w:val="left"/>
+      <w:pPr>
+        <w:ind w:left="3600" w:hanging="360"/>
+      </w:pPr>
+      <w:rPr>
+        <w:rFonts w:ascii="Courier New" w:hAnsi="Courier New" w:cs="Courier New" w:hint="default"/>
+      </w:rPr>
+    </w:lvl>
+    <w:lvl w:ilvl="5" w:tplc="08090005" w:tentative="1">
+      <w:start w:val="1"/>
+      <w:numFmt w:val="bullet"/>
+      <w:lvlText w:val=""/>
+      <w:lvlJc w:val="left"/>
+      <w:pPr>
+        <w:ind w:left="4320" w:hanging="360"/>
+      </w:pPr>
+      <w:rPr>
+        <w:rFonts w:ascii="Wingdings" w:hAnsi="Wingdings" w:hint="default"/>
+      </w:rPr>
+    </w:lvl>
+    <w:lvl w:ilvl="6" w:tplc="08090001" w:tentative="1">
+      <w:start w:val="1"/>
+      <w:numFmt w:val="bullet"/>
+      <w:lvlText w:val=""/>
+      <w:lvlJc w:val="left"/>
+      <w:pPr>
+        <w:ind w:left="5040" w:hanging="360"/>
+      </w:pPr>
+      <w:rPr>
+        <w:rFonts w:ascii="Symbol" w:hAnsi="Symbol" w:hint="default"/>
+      </w:rPr>
+    </w:lvl>
+    <w:lvl w:ilvl="7" w:tplc="08090003" w:tentative="1">
+      <w:start w:val="1"/>
+      <w:numFmt w:val="bullet"/>
+      <w:lvlText w:val="o"/>
+      <w:lvlJc w:val="left"/>
+      <w:pPr>
+        <w:ind w:left="5760" w:hanging="360"/>
+      </w:pPr>
+      <w:rPr>
+        <w:rFonts w:ascii="Courier New" w:hAnsi="Courier New" w:cs="Courier New" w:hint="default"/>
+      </w:rPr>
+    </w:lvl>
+    <w:lvl w:ilvl="8" w:tplc="08090005" w:tentative="1">
+      <w:start w:val="1"/>
+      <w:numFmt w:val="bullet"/>
+      <w:lvlText w:val=""/>
+      <w:lvlJc w:val="left"/>
+      <w:pPr>
+        <w:ind w:left="6480" w:hanging="360"/>
+      </w:pPr>
+      <w:rPr>
+        <w:rFonts w:ascii="Wingdings" w:hAnsi="Wingdings" w:hint="default"/>
+      </w:rPr>
+    </w:lvl>
+  </w:abstractNum>
+  <w:abstractNum w:abstractNumId="2" w15:restartNumberingAfterBreak="0">
     <w:nsid w:val="282D0E99"/>
     <w:multiLevelType w:val="hybridMultilevel"/>
     <w:tmpl w:val="520881F0"/>
@@ -369,8 +2998,542 @@
       </w:rPr>
     </w:lvl>
   </w:abstractNum>
+  <w:abstractNum w:abstractNumId="3" w15:restartNumberingAfterBreak="0">
+    <w:nsid w:val="28BB3592"/>
+    <w:multiLevelType w:val="hybridMultilevel"/>
+    <w:tmpl w:val="21C257FC"/>
+    <w:lvl w:ilvl="0" w:tplc="0F349498">
+      <w:numFmt w:val="bullet"/>
+      <w:lvlText w:val="-"/>
+      <w:lvlJc w:val="left"/>
+      <w:pPr>
+        <w:ind w:left="720" w:hanging="360"/>
+      </w:pPr>
+      <w:rPr>
+        <w:rFonts w:ascii="Aptos" w:eastAsiaTheme="minorHAnsi" w:hAnsi="Aptos" w:cstheme="minorBidi" w:hint="default"/>
+      </w:rPr>
+    </w:lvl>
+    <w:lvl w:ilvl="1" w:tplc="08090003" w:tentative="1">
+      <w:start w:val="1"/>
+      <w:numFmt w:val="bullet"/>
+      <w:lvlText w:val="o"/>
+      <w:lvlJc w:val="left"/>
+      <w:pPr>
+        <w:ind w:left="1440" w:hanging="360"/>
+      </w:pPr>
+      <w:rPr>
+        <w:rFonts w:ascii="Courier New" w:hAnsi="Courier New" w:cs="Courier New" w:hint="default"/>
+      </w:rPr>
+    </w:lvl>
+    <w:lvl w:ilvl="2" w:tplc="08090005" w:tentative="1">
+      <w:start w:val="1"/>
+      <w:numFmt w:val="bullet"/>
+      <w:lvlText w:val=""/>
+      <w:lvlJc w:val="left"/>
+      <w:pPr>
+        <w:ind w:left="2160" w:hanging="360"/>
+      </w:pPr>
+      <w:rPr>
+        <w:rFonts w:ascii="Wingdings" w:hAnsi="Wingdings" w:hint="default"/>
+      </w:rPr>
+    </w:lvl>
+    <w:lvl w:ilvl="3" w:tplc="08090001" w:tentative="1">
+      <w:start w:val="1"/>
+      <w:numFmt w:val="bullet"/>
+      <w:lvlText w:val=""/>
+      <w:lvlJc w:val="left"/>
+      <w:pPr>
+        <w:ind w:left="2880" w:hanging="360"/>
+      </w:pPr>
+      <w:rPr>
+        <w:rFonts w:ascii="Symbol" w:hAnsi="Symbol" w:hint="default"/>
+      </w:rPr>
+    </w:lvl>
+    <w:lvl w:ilvl="4" w:tplc="08090003" w:tentative="1">
+      <w:start w:val="1"/>
+      <w:numFmt w:val="bullet"/>
+      <w:lvlText w:val="o"/>
+      <w:lvlJc w:val="left"/>
+      <w:pPr>
+        <w:ind w:left="3600" w:hanging="360"/>
+      </w:pPr>
+      <w:rPr>
+        <w:rFonts w:ascii="Courier New" w:hAnsi="Courier New" w:cs="Courier New" w:hint="default"/>
+      </w:rPr>
+    </w:lvl>
+    <w:lvl w:ilvl="5" w:tplc="08090005" w:tentative="1">
+      <w:start w:val="1"/>
+      <w:numFmt w:val="bullet"/>
+      <w:lvlText w:val=""/>
+      <w:lvlJc w:val="left"/>
+      <w:pPr>
+        <w:ind w:left="4320" w:hanging="360"/>
+      </w:pPr>
+      <w:rPr>
+        <w:rFonts w:ascii="Wingdings" w:hAnsi="Wingdings" w:hint="default"/>
+      </w:rPr>
+    </w:lvl>
+    <w:lvl w:ilvl="6" w:tplc="08090001" w:tentative="1">
+      <w:start w:val="1"/>
+      <w:numFmt w:val="bullet"/>
+      <w:lvlText w:val=""/>
+      <w:lvlJc w:val="left"/>
+      <w:pPr>
+        <w:ind w:left="5040" w:hanging="360"/>
+      </w:pPr>
+      <w:rPr>
+        <w:rFonts w:ascii="Symbol" w:hAnsi="Symbol" w:hint="default"/>
+      </w:rPr>
+    </w:lvl>
+    <w:lvl w:ilvl="7" w:tplc="08090003" w:tentative="1">
+      <w:start w:val="1"/>
+      <w:numFmt w:val="bullet"/>
+      <w:lvlText w:val="o"/>
+      <w:lvlJc w:val="left"/>
+      <w:pPr>
+        <w:ind w:left="5760" w:hanging="360"/>
+      </w:pPr>
+      <w:rPr>
+        <w:rFonts w:ascii="Courier New" w:hAnsi="Courier New" w:cs="Courier New" w:hint="default"/>
+      </w:rPr>
+    </w:lvl>
+    <w:lvl w:ilvl="8" w:tplc="08090005" w:tentative="1">
+      <w:start w:val="1"/>
+      <w:numFmt w:val="bullet"/>
+      <w:lvlText w:val=""/>
+      <w:lvlJc w:val="left"/>
+      <w:pPr>
+        <w:ind w:left="6480" w:hanging="360"/>
+      </w:pPr>
+      <w:rPr>
+        <w:rFonts w:ascii="Wingdings" w:hAnsi="Wingdings" w:hint="default"/>
+      </w:rPr>
+    </w:lvl>
+  </w:abstractNum>
+  <w:abstractNum w:abstractNumId="4" w15:restartNumberingAfterBreak="0">
+    <w:nsid w:val="4575642D"/>
+    <w:multiLevelType w:val="hybridMultilevel"/>
+    <w:tmpl w:val="02B06AA8"/>
+    <w:lvl w:ilvl="0" w:tplc="0809000F">
+      <w:start w:val="1"/>
+      <w:numFmt w:val="decimal"/>
+      <w:lvlText w:val="%1."/>
+      <w:lvlJc w:val="left"/>
+      <w:pPr>
+        <w:ind w:left="720" w:hanging="360"/>
+      </w:pPr>
+      <w:rPr>
+        <w:rFonts w:hint="default"/>
+      </w:rPr>
+    </w:lvl>
+    <w:lvl w:ilvl="1" w:tplc="08090019" w:tentative="1">
+      <w:start w:val="1"/>
+      <w:numFmt w:val="lowerLetter"/>
+      <w:lvlText w:val="%2."/>
+      <w:lvlJc w:val="left"/>
+      <w:pPr>
+        <w:ind w:left="1440" w:hanging="360"/>
+      </w:pPr>
+    </w:lvl>
+    <w:lvl w:ilvl="2" w:tplc="0809001B" w:tentative="1">
+      <w:start w:val="1"/>
+      <w:numFmt w:val="lowerRoman"/>
+      <w:lvlText w:val="%3."/>
+      <w:lvlJc w:val="right"/>
+      <w:pPr>
+        <w:ind w:left="2160" w:hanging="180"/>
+      </w:pPr>
+    </w:lvl>
+    <w:lvl w:ilvl="3" w:tplc="0809000F" w:tentative="1">
+      <w:start w:val="1"/>
+      <w:numFmt w:val="decimal"/>
+      <w:lvlText w:val="%4."/>
+      <w:lvlJc w:val="left"/>
+      <w:pPr>
+        <w:ind w:left="2880" w:hanging="360"/>
+      </w:pPr>
+    </w:lvl>
+    <w:lvl w:ilvl="4" w:tplc="08090019" w:tentative="1">
+      <w:start w:val="1"/>
+      <w:numFmt w:val="lowerLetter"/>
+      <w:lvlText w:val="%5."/>
+      <w:lvlJc w:val="left"/>
+      <w:pPr>
+        <w:ind w:left="3600" w:hanging="360"/>
+      </w:pPr>
+    </w:lvl>
+    <w:lvl w:ilvl="5" w:tplc="0809001B" w:tentative="1">
+      <w:start w:val="1"/>
+      <w:numFmt w:val="lowerRoman"/>
+      <w:lvlText w:val="%6."/>
+      <w:lvlJc w:val="right"/>
+      <w:pPr>
+        <w:ind w:left="4320" w:hanging="180"/>
+      </w:pPr>
+    </w:lvl>
+    <w:lvl w:ilvl="6" w:tplc="0809000F" w:tentative="1">
+      <w:start w:val="1"/>
+      <w:numFmt w:val="decimal"/>
+      <w:lvlText w:val="%7."/>
+      <w:lvlJc w:val="left"/>
+      <w:pPr>
+        <w:ind w:left="5040" w:hanging="360"/>
+      </w:pPr>
+    </w:lvl>
+    <w:lvl w:ilvl="7" w:tplc="08090019" w:tentative="1">
+      <w:start w:val="1"/>
+      <w:numFmt w:val="lowerLetter"/>
+      <w:lvlText w:val="%8."/>
+      <w:lvlJc w:val="left"/>
+      <w:pPr>
+        <w:ind w:left="5760" w:hanging="360"/>
+      </w:pPr>
+    </w:lvl>
+    <w:lvl w:ilvl="8" w:tplc="0809001B" w:tentative="1">
+      <w:start w:val="1"/>
+      <w:numFmt w:val="lowerRoman"/>
+      <w:lvlText w:val="%9."/>
+      <w:lvlJc w:val="right"/>
+      <w:pPr>
+        <w:ind w:left="6480" w:hanging="180"/>
+      </w:pPr>
+    </w:lvl>
+  </w:abstractNum>
+  <w:abstractNum w:abstractNumId="5" w15:restartNumberingAfterBreak="0">
+    <w:nsid w:val="6318562A"/>
+    <w:multiLevelType w:val="hybridMultilevel"/>
+    <w:tmpl w:val="A5A8AF42"/>
+    <w:lvl w:ilvl="0" w:tplc="0809000F">
+      <w:start w:val="1"/>
+      <w:numFmt w:val="decimal"/>
+      <w:lvlText w:val="%1."/>
+      <w:lvlJc w:val="left"/>
+      <w:pPr>
+        <w:ind w:left="720" w:hanging="360"/>
+      </w:pPr>
+    </w:lvl>
+    <w:lvl w:ilvl="1" w:tplc="08090019" w:tentative="1">
+      <w:start w:val="1"/>
+      <w:numFmt w:val="lowerLetter"/>
+      <w:lvlText w:val="%2."/>
+      <w:lvlJc w:val="left"/>
+      <w:pPr>
+        <w:ind w:left="1440" w:hanging="360"/>
+      </w:pPr>
+    </w:lvl>
+    <w:lvl w:ilvl="2" w:tplc="0809001B" w:tentative="1">
+      <w:start w:val="1"/>
+      <w:numFmt w:val="lowerRoman"/>
+      <w:lvlText w:val="%3."/>
+      <w:lvlJc w:val="right"/>
+      <w:pPr>
+        <w:ind w:left="2160" w:hanging="180"/>
+      </w:pPr>
+    </w:lvl>
+    <w:lvl w:ilvl="3" w:tplc="0809000F" w:tentative="1">
+      <w:start w:val="1"/>
+      <w:numFmt w:val="decimal"/>
+      <w:lvlText w:val="%4."/>
+      <w:lvlJc w:val="left"/>
+      <w:pPr>
+        <w:ind w:left="2880" w:hanging="360"/>
+      </w:pPr>
+    </w:lvl>
+    <w:lvl w:ilvl="4" w:tplc="08090019" w:tentative="1">
+      <w:start w:val="1"/>
+      <w:numFmt w:val="lowerLetter"/>
+      <w:lvlText w:val="%5."/>
+      <w:lvlJc w:val="left"/>
+      <w:pPr>
+        <w:ind w:left="3600" w:hanging="360"/>
+      </w:pPr>
+    </w:lvl>
+    <w:lvl w:ilvl="5" w:tplc="0809001B" w:tentative="1">
+      <w:start w:val="1"/>
+      <w:numFmt w:val="lowerRoman"/>
+      <w:lvlText w:val="%6."/>
+      <w:lvlJc w:val="right"/>
+      <w:pPr>
+        <w:ind w:left="4320" w:hanging="180"/>
+      </w:pPr>
+    </w:lvl>
+    <w:lvl w:ilvl="6" w:tplc="0809000F" w:tentative="1">
+      <w:start w:val="1"/>
+      <w:numFmt w:val="decimal"/>
+      <w:lvlText w:val="%7."/>
+      <w:lvlJc w:val="left"/>
+      <w:pPr>
+        <w:ind w:left="5040" w:hanging="360"/>
+      </w:pPr>
+    </w:lvl>
+    <w:lvl w:ilvl="7" w:tplc="08090019" w:tentative="1">
+      <w:start w:val="1"/>
+      <w:numFmt w:val="lowerLetter"/>
+      <w:lvlText w:val="%8."/>
+      <w:lvlJc w:val="left"/>
+      <w:pPr>
+        <w:ind w:left="5760" w:hanging="360"/>
+      </w:pPr>
+    </w:lvl>
+    <w:lvl w:ilvl="8" w:tplc="0809001B" w:tentative="1">
+      <w:start w:val="1"/>
+      <w:numFmt w:val="lowerRoman"/>
+      <w:lvlText w:val="%9."/>
+      <w:lvlJc w:val="right"/>
+      <w:pPr>
+        <w:ind w:left="6480" w:hanging="180"/>
+      </w:pPr>
+    </w:lvl>
+  </w:abstractNum>
+  <w:abstractNum w:abstractNumId="6" w15:restartNumberingAfterBreak="0">
+    <w:nsid w:val="6A127A8F"/>
+    <w:multiLevelType w:val="hybridMultilevel"/>
+    <w:tmpl w:val="3CF0165A"/>
+    <w:lvl w:ilvl="0" w:tplc="08090001">
+      <w:start w:val="1"/>
+      <w:numFmt w:val="bullet"/>
+      <w:lvlText w:val=""/>
+      <w:lvlJc w:val="left"/>
+      <w:pPr>
+        <w:ind w:left="720" w:hanging="360"/>
+      </w:pPr>
+      <w:rPr>
+        <w:rFonts w:ascii="Symbol" w:hAnsi="Symbol" w:hint="default"/>
+      </w:rPr>
+    </w:lvl>
+    <w:lvl w:ilvl="1" w:tplc="08090003" w:tentative="1">
+      <w:start w:val="1"/>
+      <w:numFmt w:val="bullet"/>
+      <w:lvlText w:val="o"/>
+      <w:lvlJc w:val="left"/>
+      <w:pPr>
+        <w:ind w:left="1440" w:hanging="360"/>
+      </w:pPr>
+      <w:rPr>
+        <w:rFonts w:ascii="Courier New" w:hAnsi="Courier New" w:cs="Courier New" w:hint="default"/>
+      </w:rPr>
+    </w:lvl>
+    <w:lvl w:ilvl="2" w:tplc="08090005" w:tentative="1">
+      <w:start w:val="1"/>
+      <w:numFmt w:val="bullet"/>
+      <w:lvlText w:val=""/>
+      <w:lvlJc w:val="left"/>
+      <w:pPr>
+        <w:ind w:left="2160" w:hanging="360"/>
+      </w:pPr>
+      <w:rPr>
+        <w:rFonts w:ascii="Wingdings" w:hAnsi="Wingdings" w:hint="default"/>
+      </w:rPr>
+    </w:lvl>
+    <w:lvl w:ilvl="3" w:tplc="08090001" w:tentative="1">
+      <w:start w:val="1"/>
+      <w:numFmt w:val="bullet"/>
+      <w:lvlText w:val=""/>
+      <w:lvlJc w:val="left"/>
+      <w:pPr>
+        <w:ind w:left="2880" w:hanging="360"/>
+      </w:pPr>
+      <w:rPr>
+        <w:rFonts w:ascii="Symbol" w:hAnsi="Symbol" w:hint="default"/>
+      </w:rPr>
+    </w:lvl>
+    <w:lvl w:ilvl="4" w:tplc="08090003" w:tentative="1">
+      <w:start w:val="1"/>
+      <w:numFmt w:val="bullet"/>
+      <w:lvlText w:val="o"/>
+      <w:lvlJc w:val="left"/>
+      <w:pPr>
+        <w:ind w:left="3600" w:hanging="360"/>
+      </w:pPr>
+      <w:rPr>
+        <w:rFonts w:ascii="Courier New" w:hAnsi="Courier New" w:cs="Courier New" w:hint="default"/>
+      </w:rPr>
+    </w:lvl>
+    <w:lvl w:ilvl="5" w:tplc="08090005" w:tentative="1">
+      <w:start w:val="1"/>
+      <w:numFmt w:val="bullet"/>
+      <w:lvlText w:val=""/>
+      <w:lvlJc w:val="left"/>
+      <w:pPr>
+        <w:ind w:left="4320" w:hanging="360"/>
+      </w:pPr>
+      <w:rPr>
+        <w:rFonts w:ascii="Wingdings" w:hAnsi="Wingdings" w:hint="default"/>
+      </w:rPr>
+    </w:lvl>
+    <w:lvl w:ilvl="6" w:tplc="08090001" w:tentative="1">
+      <w:start w:val="1"/>
+      <w:numFmt w:val="bullet"/>
+      <w:lvlText w:val=""/>
+      <w:lvlJc w:val="left"/>
+      <w:pPr>
+        <w:ind w:left="5040" w:hanging="360"/>
+      </w:pPr>
+      <w:rPr>
+        <w:rFonts w:ascii="Symbol" w:hAnsi="Symbol" w:hint="default"/>
+      </w:rPr>
+    </w:lvl>
+    <w:lvl w:ilvl="7" w:tplc="08090003" w:tentative="1">
+      <w:start w:val="1"/>
+      <w:numFmt w:val="bullet"/>
+      <w:lvlText w:val="o"/>
+      <w:lvlJc w:val="left"/>
+      <w:pPr>
+        <w:ind w:left="5760" w:hanging="360"/>
+      </w:pPr>
+      <w:rPr>
+        <w:rFonts w:ascii="Courier New" w:hAnsi="Courier New" w:cs="Courier New" w:hint="default"/>
+      </w:rPr>
+    </w:lvl>
+    <w:lvl w:ilvl="8" w:tplc="08090005" w:tentative="1">
+      <w:start w:val="1"/>
+      <w:numFmt w:val="bullet"/>
+      <w:lvlText w:val=""/>
+      <w:lvlJc w:val="left"/>
+      <w:pPr>
+        <w:ind w:left="6480" w:hanging="360"/>
+      </w:pPr>
+      <w:rPr>
+        <w:rFonts w:ascii="Wingdings" w:hAnsi="Wingdings" w:hint="default"/>
+      </w:rPr>
+    </w:lvl>
+  </w:abstractNum>
+  <w:abstractNum w:abstractNumId="7" w15:restartNumberingAfterBreak="0">
+    <w:nsid w:val="7B2F7F60"/>
+    <w:multiLevelType w:val="hybridMultilevel"/>
+    <w:tmpl w:val="0B1C7D90"/>
+    <w:lvl w:ilvl="0" w:tplc="08090001">
+      <w:start w:val="1"/>
+      <w:numFmt w:val="bullet"/>
+      <w:lvlText w:val=""/>
+      <w:lvlJc w:val="left"/>
+      <w:pPr>
+        <w:ind w:left="720" w:hanging="360"/>
+      </w:pPr>
+      <w:rPr>
+        <w:rFonts w:ascii="Symbol" w:hAnsi="Symbol" w:hint="default"/>
+      </w:rPr>
+    </w:lvl>
+    <w:lvl w:ilvl="1" w:tplc="FFFFFFFF" w:tentative="1">
+      <w:start w:val="1"/>
+      <w:numFmt w:val="bullet"/>
+      <w:lvlText w:val="o"/>
+      <w:lvlJc w:val="left"/>
+      <w:pPr>
+        <w:ind w:left="1440" w:hanging="360"/>
+      </w:pPr>
+      <w:rPr>
+        <w:rFonts w:ascii="Courier New" w:hAnsi="Courier New" w:cs="Courier New" w:hint="default"/>
+      </w:rPr>
+    </w:lvl>
+    <w:lvl w:ilvl="2" w:tplc="FFFFFFFF" w:tentative="1">
+      <w:start w:val="1"/>
+      <w:numFmt w:val="bullet"/>
+      <w:lvlText w:val=""/>
+      <w:lvlJc w:val="left"/>
+      <w:pPr>
+        <w:ind w:left="2160" w:hanging="360"/>
+      </w:pPr>
+      <w:rPr>
+        <w:rFonts w:ascii="Wingdings" w:hAnsi="Wingdings" w:hint="default"/>
+      </w:rPr>
+    </w:lvl>
+    <w:lvl w:ilvl="3" w:tplc="FFFFFFFF" w:tentative="1">
+      <w:start w:val="1"/>
+      <w:numFmt w:val="bullet"/>
+      <w:lvlText w:val=""/>
+      <w:lvlJc w:val="left"/>
+      <w:pPr>
+        <w:ind w:left="2880" w:hanging="360"/>
+      </w:pPr>
+      <w:rPr>
+        <w:rFonts w:ascii="Symbol" w:hAnsi="Symbol" w:hint="default"/>
+      </w:rPr>
+    </w:lvl>
+    <w:lvl w:ilvl="4" w:tplc="FFFFFFFF" w:tentative="1">
+      <w:start w:val="1"/>
+      <w:numFmt w:val="bullet"/>
+      <w:lvlText w:val="o"/>
+      <w:lvlJc w:val="left"/>
+      <w:pPr>
+        <w:ind w:left="3600" w:hanging="360"/>
+      </w:pPr>
+      <w:rPr>
+        <w:rFonts w:ascii="Courier New" w:hAnsi="Courier New" w:cs="Courier New" w:hint="default"/>
+      </w:rPr>
+    </w:lvl>
+    <w:lvl w:ilvl="5" w:tplc="FFFFFFFF" w:tentative="1">
+      <w:start w:val="1"/>
+      <w:numFmt w:val="bullet"/>
+      <w:lvlText w:val=""/>
+      <w:lvlJc w:val="left"/>
+      <w:pPr>
+        <w:ind w:left="4320" w:hanging="360"/>
+      </w:pPr>
+      <w:rPr>
+        <w:rFonts w:ascii="Wingdings" w:hAnsi="Wingdings" w:hint="default"/>
+      </w:rPr>
+    </w:lvl>
+    <w:lvl w:ilvl="6" w:tplc="FFFFFFFF" w:tentative="1">
+      <w:start w:val="1"/>
+      <w:numFmt w:val="bullet"/>
+      <w:lvlText w:val=""/>
+      <w:lvlJc w:val="left"/>
+      <w:pPr>
+        <w:ind w:left="5040" w:hanging="360"/>
+      </w:pPr>
+      <w:rPr>
+        <w:rFonts w:ascii="Symbol" w:hAnsi="Symbol" w:hint="default"/>
+      </w:rPr>
+    </w:lvl>
+    <w:lvl w:ilvl="7" w:tplc="FFFFFFFF" w:tentative="1">
+      <w:start w:val="1"/>
+      <w:numFmt w:val="bullet"/>
+      <w:lvlText w:val="o"/>
+      <w:lvlJc w:val="left"/>
+      <w:pPr>
+        <w:ind w:left="5760" w:hanging="360"/>
+      </w:pPr>
+      <w:rPr>
+        <w:rFonts w:ascii="Courier New" w:hAnsi="Courier New" w:cs="Courier New" w:hint="default"/>
+      </w:rPr>
+    </w:lvl>
+    <w:lvl w:ilvl="8" w:tplc="FFFFFFFF" w:tentative="1">
+      <w:start w:val="1"/>
+      <w:numFmt w:val="bullet"/>
+      <w:lvlText w:val=""/>
+      <w:lvlJc w:val="left"/>
+      <w:pPr>
+        <w:ind w:left="6480" w:hanging="360"/>
+      </w:pPr>
+      <w:rPr>
+        <w:rFonts w:ascii="Wingdings" w:hAnsi="Wingdings" w:hint="default"/>
+      </w:rPr>
+    </w:lvl>
+  </w:abstractNum>
   <w:num w:numId="1" w16cid:durableId="1521893884">
+    <w:abstractNumId w:val="2"/>
+  </w:num>
+  <w:num w:numId="2" w16cid:durableId="1219778639">
+    <w:abstractNumId w:val="1"/>
+  </w:num>
+  <w:num w:numId="3" w16cid:durableId="276371836">
+    <w:abstractNumId w:val="6"/>
+  </w:num>
+  <w:num w:numId="4" w16cid:durableId="2106534884">
+    <w:abstractNumId w:val="3"/>
+  </w:num>
+  <w:num w:numId="5" w16cid:durableId="1208755942">
+    <w:abstractNumId w:val="7"/>
+  </w:num>
+  <w:num w:numId="6" w16cid:durableId="243533737">
     <w:abstractNumId w:val="0"/>
+  </w:num>
+  <w:num w:numId="7" w16cid:durableId="1931622363">
+    <w:abstractNumId w:val="4"/>
+  </w:num>
+  <w:num w:numId="8" w16cid:durableId="745803115">
+    <w:abstractNumId w:val="5"/>
   </w:num>
 </w:numbering>
 </file>
@@ -1292,6 +4455,41 @@
       <w:spacing w:val="5"/>
     </w:rPr>
   </w:style>
+  <w:style w:type="character" w:styleId="Hyperlink">
+    <w:name w:val="Hyperlink"/>
+    <w:basedOn w:val="DefaultParagraphFont"/>
+    <w:uiPriority w:val="99"/>
+    <w:unhideWhenUsed/>
+    <w:rsid w:val="008D06D2"/>
+    <w:rPr>
+      <w:color w:val="467886" w:themeColor="hyperlink"/>
+      <w:u w:val="single"/>
+    </w:rPr>
+  </w:style>
+  <w:style w:type="character" w:styleId="UnresolvedMention">
+    <w:name w:val="Unresolved Mention"/>
+    <w:basedOn w:val="DefaultParagraphFont"/>
+    <w:uiPriority w:val="99"/>
+    <w:semiHidden/>
+    <w:unhideWhenUsed/>
+    <w:rsid w:val="008D06D2"/>
+    <w:rPr>
+      <w:color w:val="605E5C"/>
+      <w:shd w:val="clear" w:color="auto" w:fill="E1DFDD"/>
+    </w:rPr>
+  </w:style>
+  <w:style w:type="character" w:styleId="FollowedHyperlink">
+    <w:name w:val="FollowedHyperlink"/>
+    <w:basedOn w:val="DefaultParagraphFont"/>
+    <w:uiPriority w:val="99"/>
+    <w:semiHidden/>
+    <w:unhideWhenUsed/>
+    <w:rsid w:val="00D57D21"/>
+    <w:rPr>
+      <w:color w:val="96607D" w:themeColor="followedHyperlink"/>
+      <w:u w:val="single"/>
+    </w:rPr>
+  </w:style>
 </w:styles>
 </file>
 

</xml_diff>